<commit_message>
Ajout du shéma de la pipeline d'ETL
</commit_message>
<xml_diff>
--- a/Rapport.docx
+++ b/Rapport.docx
@@ -94,16 +94,45 @@
           <w:lang w:eastAsia="fr-CA"/>
           <w14:ligatures w14:val="none"/>
         </w:rPr>
-        <w:t xml:space="preserve"> : Nous avons utilisé les données d'OpenStreetMap (OSM) pour extraire les points d'intérêt correspondant aux restaurants dans Paris. </w:t>
-      </w:r>
-      <w:r>
-        <w:rPr>
-          <w:rFonts w:ascii="Times New Roman" w:eastAsia="Times New Roman" w:hAnsi="Times New Roman" w:cs="Times New Roman"/>
-          <w:kern w:val="0"/>
-          <w:lang w:eastAsia="fr-CA"/>
-          <w14:ligatures w14:val="none"/>
-        </w:rPr>
-        <w:t xml:space="preserve">OSM offer pleins d’informations mais nous avons </w:t>
+        <w:t xml:space="preserve"> : Nous avons utilisé les données d'</w:t>
+      </w:r>
+      <w:proofErr w:type="spellStart"/>
+      <w:r>
+        <w:rPr>
+          <w:rFonts w:ascii="Times New Roman" w:eastAsia="Times New Roman" w:hAnsi="Times New Roman" w:cs="Times New Roman"/>
+          <w:kern w:val="0"/>
+          <w:lang w:eastAsia="fr-CA"/>
+          <w14:ligatures w14:val="none"/>
+        </w:rPr>
+        <w:t>OpenStreetMap</w:t>
+      </w:r>
+      <w:proofErr w:type="spellEnd"/>
+      <w:r>
+        <w:rPr>
+          <w:rFonts w:ascii="Times New Roman" w:eastAsia="Times New Roman" w:hAnsi="Times New Roman" w:cs="Times New Roman"/>
+          <w:kern w:val="0"/>
+          <w:lang w:eastAsia="fr-CA"/>
+          <w14:ligatures w14:val="none"/>
+        </w:rPr>
+        <w:t xml:space="preserve"> (OSM) pour extraire les points d'intérêt correspondant aux restaurants dans Paris. OSM off</w:t>
+      </w:r>
+      <w:r>
+        <w:rPr>
+          <w:rFonts w:ascii="Times New Roman" w:eastAsia="Times New Roman" w:hAnsi="Times New Roman" w:cs="Times New Roman"/>
+          <w:kern w:val="0"/>
+          <w:lang w:eastAsia="fr-CA"/>
+          <w14:ligatures w14:val="none"/>
+        </w:rPr>
+        <w:t>re</w:t>
+      </w:r>
+      <w:r>
+        <w:rPr>
+          <w:rFonts w:ascii="Times New Roman" w:eastAsia="Times New Roman" w:hAnsi="Times New Roman" w:cs="Times New Roman"/>
+          <w:kern w:val="0"/>
+          <w:lang w:eastAsia="fr-CA"/>
+          <w14:ligatures w14:val="none"/>
+        </w:rPr>
+        <w:t xml:space="preserve"> pleins d’informations mais nous avons </w:t>
       </w:r>
       <w:r>
         <w:rPr>
@@ -123,15 +152,27 @@
         </w:rPr>
         <w:t xml:space="preserve"> </w:t>
       </w:r>
-      <w:r>
-        <w:rPr>
-          <w:rFonts w:ascii="Times New Roman" w:eastAsia="Times New Roman" w:hAnsi="Times New Roman" w:cs="Times New Roman"/>
-          <w:kern w:val="0"/>
-          <w:lang w:eastAsia="fr-CA"/>
-          <w14:ligatures w14:val="none"/>
-        </w:rPr>
-        <w:t xml:space="preserve">osmid, </w:t>
-      </w:r>
+      <w:proofErr w:type="spellStart"/>
+      <w:r>
+        <w:rPr>
+          <w:rFonts w:ascii="Times New Roman" w:eastAsia="Times New Roman" w:hAnsi="Times New Roman" w:cs="Times New Roman"/>
+          <w:kern w:val="0"/>
+          <w:lang w:eastAsia="fr-CA"/>
+          <w14:ligatures w14:val="none"/>
+        </w:rPr>
+        <w:t>osmid</w:t>
+      </w:r>
+      <w:proofErr w:type="spellEnd"/>
+      <w:r>
+        <w:rPr>
+          <w:rFonts w:ascii="Times New Roman" w:eastAsia="Times New Roman" w:hAnsi="Times New Roman" w:cs="Times New Roman"/>
+          <w:kern w:val="0"/>
+          <w:lang w:eastAsia="fr-CA"/>
+          <w14:ligatures w14:val="none"/>
+        </w:rPr>
+        <w:t xml:space="preserve">, </w:t>
+      </w:r>
+      <w:proofErr w:type="spellStart"/>
       <w:r>
         <w:rPr>
           <w:rFonts w:ascii="Times New Roman" w:eastAsia="Times New Roman" w:hAnsi="Times New Roman" w:cs="Times New Roman"/>
@@ -168,6 +209,7 @@
         </w:rPr>
         <w:t>e</w:t>
       </w:r>
+      <w:proofErr w:type="spellEnd"/>
       <w:r>
         <w:rPr>
           <w:rFonts w:ascii="Times New Roman" w:eastAsia="Times New Roman" w:hAnsi="Times New Roman" w:cs="Times New Roman"/>
@@ -177,23 +219,136 @@
         </w:rPr>
         <w:t xml:space="preserve">, cuisine, </w:t>
       </w:r>
-      <w:r>
-        <w:rPr>
-          <w:rFonts w:ascii="Times New Roman" w:eastAsia="Times New Roman" w:hAnsi="Times New Roman" w:cs="Times New Roman"/>
-          <w:kern w:val="0"/>
-          <w:lang w:eastAsia="fr-CA"/>
-          <w14:ligatures w14:val="none"/>
-        </w:rPr>
-        <w:t>coordinates,</w:t>
-      </w:r>
-      <w:r>
-        <w:rPr>
-          <w:rFonts w:ascii="Times New Roman" w:eastAsia="Times New Roman" w:hAnsi="Times New Roman" w:cs="Times New Roman"/>
-          <w:kern w:val="0"/>
-          <w:lang w:eastAsia="fr-CA"/>
-          <w14:ligatures w14:val="none"/>
-        </w:rPr>
-        <w:t xml:space="preserve"> addr:city, addr:housenumber, addr:postcode, addr:street, opening_hours, phone</w:t>
+      <w:proofErr w:type="spellStart"/>
+      <w:r>
+        <w:rPr>
+          <w:rFonts w:ascii="Times New Roman" w:eastAsia="Times New Roman" w:hAnsi="Times New Roman" w:cs="Times New Roman"/>
+          <w:kern w:val="0"/>
+          <w:lang w:eastAsia="fr-CA"/>
+          <w14:ligatures w14:val="none"/>
+        </w:rPr>
+        <w:t>coordinates</w:t>
+      </w:r>
+      <w:proofErr w:type="spellEnd"/>
+      <w:r>
+        <w:rPr>
+          <w:rFonts w:ascii="Times New Roman" w:eastAsia="Times New Roman" w:hAnsi="Times New Roman" w:cs="Times New Roman"/>
+          <w:kern w:val="0"/>
+          <w:lang w:eastAsia="fr-CA"/>
+          <w14:ligatures w14:val="none"/>
+        </w:rPr>
+        <w:t>,</w:t>
+      </w:r>
+      <w:r>
+        <w:rPr>
+          <w:rFonts w:ascii="Times New Roman" w:eastAsia="Times New Roman" w:hAnsi="Times New Roman" w:cs="Times New Roman"/>
+          <w:kern w:val="0"/>
+          <w:lang w:eastAsia="fr-CA"/>
+          <w14:ligatures w14:val="none"/>
+        </w:rPr>
+        <w:t xml:space="preserve"> </w:t>
+      </w:r>
+      <w:proofErr w:type="spellStart"/>
+      <w:proofErr w:type="gramStart"/>
+      <w:r>
+        <w:rPr>
+          <w:rFonts w:ascii="Times New Roman" w:eastAsia="Times New Roman" w:hAnsi="Times New Roman" w:cs="Times New Roman"/>
+          <w:kern w:val="0"/>
+          <w:lang w:eastAsia="fr-CA"/>
+          <w14:ligatures w14:val="none"/>
+        </w:rPr>
+        <w:t>addr:city</w:t>
+      </w:r>
+      <w:proofErr w:type="spellEnd"/>
+      <w:proofErr w:type="gramEnd"/>
+      <w:r>
+        <w:rPr>
+          <w:rFonts w:ascii="Times New Roman" w:eastAsia="Times New Roman" w:hAnsi="Times New Roman" w:cs="Times New Roman"/>
+          <w:kern w:val="0"/>
+          <w:lang w:eastAsia="fr-CA"/>
+          <w14:ligatures w14:val="none"/>
+        </w:rPr>
+        <w:t xml:space="preserve">, </w:t>
+      </w:r>
+      <w:proofErr w:type="spellStart"/>
+      <w:r>
+        <w:rPr>
+          <w:rFonts w:ascii="Times New Roman" w:eastAsia="Times New Roman" w:hAnsi="Times New Roman" w:cs="Times New Roman"/>
+          <w:kern w:val="0"/>
+          <w:lang w:eastAsia="fr-CA"/>
+          <w14:ligatures w14:val="none"/>
+        </w:rPr>
+        <w:t>addr:housenumber</w:t>
+      </w:r>
+      <w:proofErr w:type="spellEnd"/>
+      <w:r>
+        <w:rPr>
+          <w:rFonts w:ascii="Times New Roman" w:eastAsia="Times New Roman" w:hAnsi="Times New Roman" w:cs="Times New Roman"/>
+          <w:kern w:val="0"/>
+          <w:lang w:eastAsia="fr-CA"/>
+          <w14:ligatures w14:val="none"/>
+        </w:rPr>
+        <w:t xml:space="preserve">, </w:t>
+      </w:r>
+      <w:proofErr w:type="spellStart"/>
+      <w:r>
+        <w:rPr>
+          <w:rFonts w:ascii="Times New Roman" w:eastAsia="Times New Roman" w:hAnsi="Times New Roman" w:cs="Times New Roman"/>
+          <w:kern w:val="0"/>
+          <w:lang w:eastAsia="fr-CA"/>
+          <w14:ligatures w14:val="none"/>
+        </w:rPr>
+        <w:t>addr:postcode</w:t>
+      </w:r>
+      <w:proofErr w:type="spellEnd"/>
+      <w:r>
+        <w:rPr>
+          <w:rFonts w:ascii="Times New Roman" w:eastAsia="Times New Roman" w:hAnsi="Times New Roman" w:cs="Times New Roman"/>
+          <w:kern w:val="0"/>
+          <w:lang w:eastAsia="fr-CA"/>
+          <w14:ligatures w14:val="none"/>
+        </w:rPr>
+        <w:t xml:space="preserve">, </w:t>
+      </w:r>
+      <w:proofErr w:type="spellStart"/>
+      <w:r>
+        <w:rPr>
+          <w:rFonts w:ascii="Times New Roman" w:eastAsia="Times New Roman" w:hAnsi="Times New Roman" w:cs="Times New Roman"/>
+          <w:kern w:val="0"/>
+          <w:lang w:eastAsia="fr-CA"/>
+          <w14:ligatures w14:val="none"/>
+        </w:rPr>
+        <w:t>addr:street</w:t>
+      </w:r>
+      <w:proofErr w:type="spellEnd"/>
+      <w:r>
+        <w:rPr>
+          <w:rFonts w:ascii="Times New Roman" w:eastAsia="Times New Roman" w:hAnsi="Times New Roman" w:cs="Times New Roman"/>
+          <w:kern w:val="0"/>
+          <w:lang w:eastAsia="fr-CA"/>
+          <w14:ligatures w14:val="none"/>
+        </w:rPr>
+        <w:t xml:space="preserve">, </w:t>
+      </w:r>
+      <w:proofErr w:type="spellStart"/>
+      <w:r>
+        <w:rPr>
+          <w:rFonts w:ascii="Times New Roman" w:eastAsia="Times New Roman" w:hAnsi="Times New Roman" w:cs="Times New Roman"/>
+          <w:kern w:val="0"/>
+          <w:lang w:eastAsia="fr-CA"/>
+          <w14:ligatures w14:val="none"/>
+        </w:rPr>
+        <w:t>opening_hours</w:t>
+      </w:r>
+      <w:proofErr w:type="spellEnd"/>
+      <w:r>
+        <w:rPr>
+          <w:rFonts w:ascii="Times New Roman" w:eastAsia="Times New Roman" w:hAnsi="Times New Roman" w:cs="Times New Roman"/>
+          <w:kern w:val="0"/>
+          <w:lang w:eastAsia="fr-CA"/>
+          <w14:ligatures w14:val="none"/>
+        </w:rPr>
+        <w:t>, phone</w:t>
       </w:r>
       <w:r>
         <w:rPr>
@@ -211,7 +366,25 @@
           <w:lang w:eastAsia="fr-CA"/>
           <w14:ligatures w14:val="none"/>
         </w:rPr>
-        <w:t xml:space="preserve"> description. Ces informations permettent une analyse détaillée et une meilleure localisation des restaurants.</w:t>
+        <w:t xml:space="preserve"> description. Ces </w:t>
+      </w:r>
+      <w:r>
+        <w:rPr>
+          <w:rFonts w:ascii="Times New Roman" w:eastAsia="Times New Roman" w:hAnsi="Times New Roman" w:cs="Times New Roman"/>
+          <w:kern w:val="0"/>
+          <w:lang w:eastAsia="fr-CA"/>
+          <w14:ligatures w14:val="none"/>
+        </w:rPr>
+        <w:t>dernières</w:t>
+      </w:r>
+      <w:r>
+        <w:rPr>
+          <w:rFonts w:ascii="Times New Roman" w:eastAsia="Times New Roman" w:hAnsi="Times New Roman" w:cs="Times New Roman"/>
+          <w:kern w:val="0"/>
+          <w:lang w:eastAsia="fr-CA"/>
+          <w14:ligatures w14:val="none"/>
+        </w:rPr>
+        <w:t xml:space="preserve"> permettent une analyse détaillée et une meilleure localisation des restaurants.</w:t>
       </w:r>
     </w:p>
     <w:p>
@@ -246,7 +419,7 @@
           <w:lang w:eastAsia="fr-CA"/>
           <w14:ligatures w14:val="none"/>
         </w:rPr>
-        <w:t xml:space="preserve"> : De la même manière, nous avons extrait les pistes cyclables, en conservant les coordonnées sous forme de liste de points pour une représentation détaillée des chemins.</w:t>
+        <w:t xml:space="preserve"> : De la même manière, nous avons extrait les pistes cyclables en conservant les coordonnées sous forme de liste de points pour une représentation détaillée des chemins.</w:t>
       </w:r>
     </w:p>
     <w:p>
@@ -353,6 +526,7 @@
         </w:rPr>
         <w:t xml:space="preserve"> : Les colonnes ont été traduites en français pour améliorer la lisibilité des données, par exemple, </w:t>
       </w:r>
+      <w:proofErr w:type="spellStart"/>
       <w:r>
         <w:rPr>
           <w:rFonts w:ascii="Times New Roman" w:eastAsia="Times New Roman" w:hAnsi="Times New Roman" w:cs="Times New Roman"/>
@@ -364,6 +538,7 @@
         </w:rPr>
         <w:t>name</w:t>
       </w:r>
+      <w:proofErr w:type="spellEnd"/>
       <w:r>
         <w:rPr>
           <w:rFonts w:ascii="Times New Roman" w:eastAsia="Times New Roman" w:hAnsi="Times New Roman" w:cs="Times New Roman"/>
@@ -413,6 +588,7 @@
         </w:rPr>
         <w:t xml:space="preserve"> a été transformé en </w:t>
       </w:r>
+      <w:proofErr w:type="spellStart"/>
       <w:r>
         <w:rPr>
           <w:rFonts w:ascii="Times New Roman" w:eastAsia="Times New Roman" w:hAnsi="Times New Roman" w:cs="Times New Roman"/>
@@ -424,6 +600,7 @@
         </w:rPr>
         <w:t>type_de_restaurant</w:t>
       </w:r>
+      <w:proofErr w:type="spellEnd"/>
       <w:r>
         <w:rPr>
           <w:rFonts w:ascii="Times New Roman" w:eastAsia="Times New Roman" w:hAnsi="Times New Roman" w:cs="Times New Roman"/>
@@ -523,6 +700,7 @@
         </w:rPr>
         <w:t xml:space="preserve"> d'OSM et a été renommée en </w:t>
       </w:r>
+      <w:proofErr w:type="spellStart"/>
       <w:r>
         <w:rPr>
           <w:rFonts w:ascii="Times New Roman" w:eastAsia="Times New Roman" w:hAnsi="Times New Roman" w:cs="Times New Roman"/>
@@ -534,6 +712,7 @@
         </w:rPr>
         <w:t>type_de_restaurant</w:t>
       </w:r>
+      <w:proofErr w:type="spellEnd"/>
       <w:r>
         <w:rPr>
           <w:rFonts w:ascii="Times New Roman" w:eastAsia="Times New Roman" w:hAnsi="Times New Roman" w:cs="Times New Roman"/>
@@ -578,6 +757,7 @@
         </w:rPr>
         <w:t xml:space="preserve"> : Nous avons ajouté une nouvelle colonne </w:t>
       </w:r>
+      <w:proofErr w:type="spellStart"/>
       <w:r>
         <w:rPr>
           <w:rFonts w:ascii="Times New Roman" w:eastAsia="Times New Roman" w:hAnsi="Times New Roman" w:cs="Times New Roman"/>
@@ -589,6 +769,7 @@
         </w:rPr>
         <w:t>type_de_service</w:t>
       </w:r>
+      <w:proofErr w:type="spellEnd"/>
       <w:r>
         <w:rPr>
           <w:rFonts w:ascii="Times New Roman" w:eastAsia="Times New Roman" w:hAnsi="Times New Roman" w:cs="Times New Roman"/>
@@ -634,15 +815,37 @@
         </w:rPr>
         <w:t>", "</w:t>
       </w:r>
-      <w:r>
-        <w:rPr>
-          <w:rFonts w:ascii="Times New Roman" w:eastAsia="Times New Roman" w:hAnsi="Times New Roman" w:cs="Times New Roman"/>
-          <w:kern w:val="0"/>
-          <w:lang w:eastAsia="fr-CA"/>
-          <w14:ligatures w14:val="none"/>
-        </w:rPr>
-        <w:t>uber eats</w:t>
-      </w:r>
+      <w:proofErr w:type="spellStart"/>
+      <w:r>
+        <w:rPr>
+          <w:rFonts w:ascii="Times New Roman" w:eastAsia="Times New Roman" w:hAnsi="Times New Roman" w:cs="Times New Roman"/>
+          <w:kern w:val="0"/>
+          <w:lang w:eastAsia="fr-CA"/>
+          <w14:ligatures w14:val="none"/>
+        </w:rPr>
+        <w:t>uber</w:t>
+      </w:r>
+      <w:proofErr w:type="spellEnd"/>
+      <w:r>
+        <w:rPr>
+          <w:rFonts w:ascii="Times New Roman" w:eastAsia="Times New Roman" w:hAnsi="Times New Roman" w:cs="Times New Roman"/>
+          <w:kern w:val="0"/>
+          <w:lang w:eastAsia="fr-CA"/>
+          <w14:ligatures w14:val="none"/>
+        </w:rPr>
+        <w:t xml:space="preserve"> </w:t>
+      </w:r>
+      <w:proofErr w:type="spellStart"/>
+      <w:r>
+        <w:rPr>
+          <w:rFonts w:ascii="Times New Roman" w:eastAsia="Times New Roman" w:hAnsi="Times New Roman" w:cs="Times New Roman"/>
+          <w:kern w:val="0"/>
+          <w:lang w:eastAsia="fr-CA"/>
+          <w14:ligatures w14:val="none"/>
+        </w:rPr>
+        <w:t>eats</w:t>
+      </w:r>
+      <w:proofErr w:type="spellEnd"/>
       <w:r>
         <w:rPr>
           <w:rFonts w:ascii="Times New Roman" w:eastAsia="Times New Roman" w:hAnsi="Times New Roman" w:cs="Times New Roman"/>
@@ -855,7 +1058,27 @@
           <w:lang w:eastAsia="fr-CA"/>
           <w14:ligatures w14:val="none"/>
         </w:rPr>
-        <w:t xml:space="preserve"> : Les données transformées des restaurants sont chargées dans MongoDB pour permettre des recherches et des analyses rapides sur les options de restauration.</w:t>
+        <w:t xml:space="preserve"> : Les données transformées des </w:t>
+      </w:r>
+      <w:proofErr w:type="gramStart"/>
+      <w:r>
+        <w:rPr>
+          <w:rFonts w:ascii="Times New Roman" w:eastAsia="Times New Roman" w:hAnsi="Times New Roman" w:cs="Times New Roman"/>
+          <w:kern w:val="0"/>
+          <w:lang w:eastAsia="fr-CA"/>
+          <w14:ligatures w14:val="none"/>
+        </w:rPr>
+        <w:t>restaurants</w:t>
+      </w:r>
+      <w:proofErr w:type="gramEnd"/>
+      <w:r>
+        <w:rPr>
+          <w:rFonts w:ascii="Times New Roman" w:eastAsia="Times New Roman" w:hAnsi="Times New Roman" w:cs="Times New Roman"/>
+          <w:kern w:val="0"/>
+          <w:lang w:eastAsia="fr-CA"/>
+          <w14:ligatures w14:val="none"/>
+        </w:rPr>
+        <w:t xml:space="preserve"> sont chargées dans MongoDB pour permettre des recherches et des analyses rapides sur les options de restauration.</w:t>
       </w:r>
     </w:p>
     <w:p>
@@ -938,7 +1161,19 @@
         <w:rPr>
           <w:rFonts w:ascii="Times New Roman" w:hAnsi="Times New Roman" w:cs="Times New Roman"/>
         </w:rPr>
-        <w:t>Dans le cadre de ce projet, un processus d'acquisition incrémentale des données a été défini afin de maintenir les données de la base de données MongoDB et Neo4j à jour sans les remplacer intégralement. Cela permet de réduire les doublons et de gérer efficacement les mises à jour et ajouts de nouvelles informations.</w:t>
+        <w:t>Dans le cadre de ce projet, un processus d'acquisition incrémentale des données a été défini afin de maintenir les données de la base de données MongoDB et Neo4</w:t>
+      </w:r>
+      <w:r>
+        <w:rPr>
+          <w:rFonts w:ascii="Times New Roman" w:hAnsi="Times New Roman" w:cs="Times New Roman"/>
+        </w:rPr>
+        <w:t>J</w:t>
+      </w:r>
+      <w:r>
+        <w:rPr>
+          <w:rFonts w:ascii="Times New Roman" w:hAnsi="Times New Roman" w:cs="Times New Roman"/>
+        </w:rPr>
+        <w:t xml:space="preserve"> à jour sans les remplacer intégralement. Cela permet de réduire les doublons et de gérer efficacement les mises à jour et ajouts de nouvelles informations.</w:t>
       </w:r>
     </w:p>
     <w:p>
@@ -965,17 +1200,19 @@
         </w:rPr>
         <w:t xml:space="preserve"> : Pour chaque nouveau restaurant extrait, nous vérifions s'il existe déjà dans la base en comparant </w:t>
       </w:r>
-      <w:r>
-        <w:rPr>
-          <w:rFonts w:ascii="Times New Roman" w:hAnsi="Times New Roman" w:cs="Times New Roman"/>
-        </w:rPr>
-        <w:t>l’id de restaurant</w:t>
-      </w:r>
-      <w:r>
-        <w:rPr>
-          <w:rFonts w:ascii="Times New Roman" w:hAnsi="Times New Roman" w:cs="Times New Roman"/>
-        </w:rPr>
-        <w:t xml:space="preserve">. </w:t>
+      <w:proofErr w:type="spellStart"/>
+      <w:r>
+        <w:rPr>
+          <w:rFonts w:ascii="Times New Roman" w:hAnsi="Times New Roman" w:cs="Times New Roman"/>
+        </w:rPr>
+        <w:t>l’id</w:t>
+      </w:r>
+      <w:proofErr w:type="spellEnd"/>
+      <w:r>
+        <w:rPr>
+          <w:rFonts w:ascii="Times New Roman" w:hAnsi="Times New Roman" w:cs="Times New Roman"/>
+        </w:rPr>
+        <w:t xml:space="preserve"> de restaurant. </w:t>
       </w:r>
       <w:r>
         <w:rPr>
@@ -1009,7 +1246,15 @@
           <w:b/>
           <w:bCs/>
         </w:rPr>
-        <w:t>Neo4j</w:t>
+        <w:t>Neo4</w:t>
+      </w:r>
+      <w:r>
+        <w:rPr>
+          <w:rFonts w:ascii="Times New Roman" w:hAnsi="Times New Roman" w:cs="Times New Roman"/>
+          <w:b/>
+          <w:bCs/>
+        </w:rPr>
+        <w:t>J</w:t>
       </w:r>
       <w:r>
         <w:rPr>
@@ -1093,7 +1338,21 @@
         <w:rPr>
           <w:rFonts w:ascii="Times New Roman" w:hAnsi="Times New Roman" w:cs="Times New Roman"/>
         </w:rPr>
-        <w:t>Certaines parties de ce projet ont été réalisées avec l’aide de l’assistant IA ChatGPT, en particulier pour :</w:t>
+        <w:t xml:space="preserve">Certaines parties de ce projet ont été réalisées avec l’aide de l’assistant IA </w:t>
+      </w:r>
+      <w:proofErr w:type="spellStart"/>
+      <w:r>
+        <w:rPr>
+          <w:rFonts w:ascii="Times New Roman" w:hAnsi="Times New Roman" w:cs="Times New Roman"/>
+        </w:rPr>
+        <w:t>ChatGPT</w:t>
+      </w:r>
+      <w:proofErr w:type="spellEnd"/>
+      <w:r>
+        <w:rPr>
+          <w:rFonts w:ascii="Times New Roman" w:hAnsi="Times New Roman" w:cs="Times New Roman"/>
+        </w:rPr>
+        <w:t>, en particulier pour :</w:t>
       </w:r>
     </w:p>
     <w:p>
@@ -1118,7 +1377,21 @@
         <w:rPr>
           <w:rFonts w:ascii="Times New Roman" w:hAnsi="Times New Roman" w:cs="Times New Roman"/>
         </w:rPr>
-        <w:t xml:space="preserve"> Le script wait_for_neo4j() utilisé dans load.py pour s'assurer que Neo4j est prêt avant le chargement des données. Ce script attend la disponibilité de Neo4j en tentant de se connecter de manière répétée jusqu'à ce que le service soit prêt.</w:t>
+        <w:t xml:space="preserve"> Le script wait_for_neo4</w:t>
+      </w:r>
+      <w:proofErr w:type="gramStart"/>
+      <w:r>
+        <w:rPr>
+          <w:rFonts w:ascii="Times New Roman" w:hAnsi="Times New Roman" w:cs="Times New Roman"/>
+        </w:rPr>
+        <w:t>j(</w:t>
+      </w:r>
+      <w:proofErr w:type="gramEnd"/>
+      <w:r>
+        <w:rPr>
+          <w:rFonts w:ascii="Times New Roman" w:hAnsi="Times New Roman" w:cs="Times New Roman"/>
+        </w:rPr>
+        <w:t>) utilisé dans load.py pour s'assurer que Neo4j est prêt avant le chargement des données. Ce script attend la disponibilité de Neo4j en tentant de se connecter de manière répétée jusqu'à ce que le service soit prêt.</w:t>
       </w:r>
     </w:p>
     <w:p>
@@ -1137,13 +1410,59 @@
           <w:b/>
           <w:bCs/>
         </w:rPr>
-        <w:t>Exécution automatique des scripts dans le Dockerfile :</w:t>
-      </w:r>
-      <w:r>
-        <w:rPr>
-          <w:rFonts w:ascii="Times New Roman" w:hAnsi="Times New Roman" w:cs="Times New Roman"/>
-        </w:rPr>
-        <w:t xml:space="preserve"> La commande utilisée dans le Dockerfile pour exécuter les scripts ETL (extract.py, transform.py, load.py) a également été suggérée par ChatGPT. Cette commande garantit que le processus ETL se lance automatiquement lors du démarrage des conteneurs avec docker-compose up.</w:t>
+        <w:t xml:space="preserve">Exécution automatique des scripts dans le </w:t>
+      </w:r>
+      <w:proofErr w:type="spellStart"/>
+      <w:r>
+        <w:rPr>
+          <w:rFonts w:ascii="Times New Roman" w:hAnsi="Times New Roman" w:cs="Times New Roman"/>
+          <w:b/>
+          <w:bCs/>
+        </w:rPr>
+        <w:t>Dockerfile</w:t>
+      </w:r>
+      <w:proofErr w:type="spellEnd"/>
+      <w:r>
+        <w:rPr>
+          <w:rFonts w:ascii="Times New Roman" w:hAnsi="Times New Roman" w:cs="Times New Roman"/>
+          <w:b/>
+          <w:bCs/>
+        </w:rPr>
+        <w:t xml:space="preserve"> :</w:t>
+      </w:r>
+      <w:r>
+        <w:rPr>
+          <w:rFonts w:ascii="Times New Roman" w:hAnsi="Times New Roman" w:cs="Times New Roman"/>
+        </w:rPr>
+        <w:t xml:space="preserve"> La commande utilisée dans le </w:t>
+      </w:r>
+      <w:proofErr w:type="spellStart"/>
+      <w:r>
+        <w:rPr>
+          <w:rFonts w:ascii="Times New Roman" w:hAnsi="Times New Roman" w:cs="Times New Roman"/>
+        </w:rPr>
+        <w:t>Dockerfile</w:t>
+      </w:r>
+      <w:proofErr w:type="spellEnd"/>
+      <w:r>
+        <w:rPr>
+          <w:rFonts w:ascii="Times New Roman" w:hAnsi="Times New Roman" w:cs="Times New Roman"/>
+        </w:rPr>
+        <w:t xml:space="preserve"> pour exécuter les scripts ETL (extract.py, transform.py, load.py) a également été suggérée par </w:t>
+      </w:r>
+      <w:proofErr w:type="spellStart"/>
+      <w:r>
+        <w:rPr>
+          <w:rFonts w:ascii="Times New Roman" w:hAnsi="Times New Roman" w:cs="Times New Roman"/>
+        </w:rPr>
+        <w:t>ChatGPT</w:t>
+      </w:r>
+      <w:proofErr w:type="spellEnd"/>
+      <w:r>
+        <w:rPr>
+          <w:rFonts w:ascii="Times New Roman" w:hAnsi="Times New Roman" w:cs="Times New Roman"/>
+        </w:rPr>
+        <w:t>. Cette commande garantit que le processus ETL se lance automatiquement lors du démarrage des conteneurs avec docker-compose up.</w:t>
       </w:r>
     </w:p>
     <w:p>
@@ -1165,6 +1484,124 @@
           <w:rFonts w:ascii="Times New Roman" w:hAnsi="Times New Roman" w:cs="Times New Roman"/>
         </w:rPr>
       </w:pPr>
+    </w:p>
+    <w:p>
+      <w:pPr>
+        <w:rPr>
+          <w:rFonts w:ascii="Times New Roman" w:hAnsi="Times New Roman" w:cs="Times New Roman"/>
+          <w:b/>
+          <w:bCs/>
+        </w:rPr>
+      </w:pPr>
+      <w:r>
+        <w:rPr>
+          <w:rFonts w:ascii="Times New Roman" w:hAnsi="Times New Roman" w:cs="Times New Roman"/>
+          <w:b/>
+          <w:bCs/>
+        </w:rPr>
+        <w:lastRenderedPageBreak/>
+        <w:t xml:space="preserve">Schéma </w:t>
+      </w:r>
+      <w:proofErr w:type="gramStart"/>
+      <w:r>
+        <w:rPr>
+          <w:rFonts w:ascii="Times New Roman" w:hAnsi="Times New Roman" w:cs="Times New Roman"/>
+          <w:b/>
+          <w:bCs/>
+        </w:rPr>
+        <w:t>d</w:t>
+      </w:r>
+      <w:r>
+        <w:rPr>
+          <w:rFonts w:ascii="Times New Roman" w:hAnsi="Times New Roman" w:cs="Times New Roman"/>
+          <w:b/>
+          <w:bCs/>
+        </w:rPr>
+        <w:t>e la</w:t>
+      </w:r>
+      <w:r>
+        <w:rPr>
+          <w:rFonts w:ascii="Times New Roman" w:hAnsi="Times New Roman" w:cs="Times New Roman"/>
+          <w:b/>
+          <w:bCs/>
+        </w:rPr>
+        <w:t xml:space="preserve"> pipeline</w:t>
+      </w:r>
+      <w:proofErr w:type="gramEnd"/>
+      <w:r>
+        <w:rPr>
+          <w:rFonts w:ascii="Times New Roman" w:hAnsi="Times New Roman" w:cs="Times New Roman"/>
+          <w:b/>
+          <w:bCs/>
+        </w:rPr>
+        <w:t xml:space="preserve"> d’ETL</w:t>
+      </w:r>
+      <w:r>
+        <w:rPr>
+          <w:rFonts w:ascii="Times New Roman" w:hAnsi="Times New Roman" w:cs="Times New Roman"/>
+          <w:b/>
+          <w:bCs/>
+        </w:rPr>
+        <w:t> :</w:t>
+      </w:r>
+    </w:p>
+    <w:p>
+      <w:pPr>
+        <w:rPr>
+          <w:rFonts w:ascii="Times New Roman" w:hAnsi="Times New Roman" w:cs="Times New Roman"/>
+          <w:b/>
+          <w:bCs/>
+        </w:rPr>
+      </w:pPr>
+      <w:r>
+        <w:rPr>
+          <w:rFonts w:ascii="Times New Roman" w:hAnsi="Times New Roman" w:cs="Times New Roman"/>
+          <w:b/>
+          <w:bCs/>
+          <w:noProof/>
+        </w:rPr>
+        <w:drawing>
+          <wp:inline distT="0" distB="0" distL="0" distR="0" wp14:anchorId="410D6CA7" wp14:editId="2CFF76EA">
+            <wp:extent cx="5486400" cy="4860925"/>
+            <wp:effectExtent l="0" t="0" r="0" b="0"/>
+            <wp:docPr id="1164645789" name="Image 2"/>
+            <wp:cNvGraphicFramePr>
+              <a:graphicFrameLocks xmlns:a="http://schemas.openxmlformats.org/drawingml/2006/main" noChangeAspect="1"/>
+            </wp:cNvGraphicFramePr>
+            <a:graphic xmlns:a="http://schemas.openxmlformats.org/drawingml/2006/main">
+              <a:graphicData uri="http://schemas.openxmlformats.org/drawingml/2006/picture">
+                <pic:pic xmlns:pic="http://schemas.openxmlformats.org/drawingml/2006/picture">
+                  <pic:nvPicPr>
+                    <pic:cNvPr id="1164645789" name="Image 1164645789"/>
+                    <pic:cNvPicPr/>
+                  </pic:nvPicPr>
+                  <pic:blipFill>
+                    <a:blip r:embed="rId5">
+                      <a:extLst>
+                        <a:ext uri="{28A0092B-C50C-407E-A947-70E740481C1C}">
+                          <a14:useLocalDpi xmlns:a14="http://schemas.microsoft.com/office/drawing/2010/main" val="0"/>
+                        </a:ext>
+                      </a:extLst>
+                    </a:blip>
+                    <a:stretch>
+                      <a:fillRect/>
+                    </a:stretch>
+                  </pic:blipFill>
+                  <pic:spPr>
+                    <a:xfrm>
+                      <a:off x="0" y="0"/>
+                      <a:ext cx="5486400" cy="4860925"/>
+                    </a:xfrm>
+                    <a:prstGeom prst="rect">
+                      <a:avLst/>
+                    </a:prstGeom>
+                  </pic:spPr>
+                </pic:pic>
+              </a:graphicData>
+            </a:graphic>
+          </wp:inline>
+        </w:drawing>
+      </w:r>
     </w:p>
     <w:sectPr>
       <w:pgSz w:w="12240" w:h="15840"/>
@@ -1974,11 +2411,11 @@
     <w:name w:val="Normal"/>
     <w:qFormat/>
   </w:style>
-  <w:style w:type="paragraph" w:styleId="Heading1">
+  <w:style w:type="paragraph" w:styleId="Titre1">
     <w:name w:val="heading 1"/>
     <w:basedOn w:val="Normal"/>
     <w:next w:val="Normal"/>
-    <w:link w:val="Heading1Char"/>
+    <w:link w:val="Titre1Car"/>
     <w:uiPriority w:val="9"/>
     <w:qFormat/>
     <w:rsid w:val="00515B29"/>
@@ -1995,11 +2432,11 @@
       <w:szCs w:val="40"/>
     </w:rPr>
   </w:style>
-  <w:style w:type="paragraph" w:styleId="Heading2">
+  <w:style w:type="paragraph" w:styleId="Titre2">
     <w:name w:val="heading 2"/>
     <w:basedOn w:val="Normal"/>
     <w:next w:val="Normal"/>
-    <w:link w:val="Heading2Char"/>
+    <w:link w:val="Titre2Car"/>
     <w:uiPriority w:val="9"/>
     <w:semiHidden/>
     <w:unhideWhenUsed/>
@@ -2018,11 +2455,11 @@
       <w:szCs w:val="32"/>
     </w:rPr>
   </w:style>
-  <w:style w:type="paragraph" w:styleId="Heading3">
+  <w:style w:type="paragraph" w:styleId="Titre3">
     <w:name w:val="heading 3"/>
     <w:basedOn w:val="Normal"/>
     <w:next w:val="Normal"/>
-    <w:link w:val="Heading3Char"/>
+    <w:link w:val="Titre3Car"/>
     <w:uiPriority w:val="9"/>
     <w:semiHidden/>
     <w:unhideWhenUsed/>
@@ -2041,11 +2478,11 @@
       <w:szCs w:val="28"/>
     </w:rPr>
   </w:style>
-  <w:style w:type="paragraph" w:styleId="Heading4">
+  <w:style w:type="paragraph" w:styleId="Titre4">
     <w:name w:val="heading 4"/>
     <w:basedOn w:val="Normal"/>
     <w:next w:val="Normal"/>
-    <w:link w:val="Heading4Char"/>
+    <w:link w:val="Titre4Car"/>
     <w:uiPriority w:val="9"/>
     <w:semiHidden/>
     <w:unhideWhenUsed/>
@@ -2064,11 +2501,11 @@
       <w:color w:val="0F4761" w:themeColor="accent1" w:themeShade="BF"/>
     </w:rPr>
   </w:style>
-  <w:style w:type="paragraph" w:styleId="Heading5">
+  <w:style w:type="paragraph" w:styleId="Titre5">
     <w:name w:val="heading 5"/>
     <w:basedOn w:val="Normal"/>
     <w:next w:val="Normal"/>
-    <w:link w:val="Heading5Char"/>
+    <w:link w:val="Titre5Car"/>
     <w:uiPriority w:val="9"/>
     <w:semiHidden/>
     <w:unhideWhenUsed/>
@@ -2085,11 +2522,11 @@
       <w:color w:val="0F4761" w:themeColor="accent1" w:themeShade="BF"/>
     </w:rPr>
   </w:style>
-  <w:style w:type="paragraph" w:styleId="Heading6">
+  <w:style w:type="paragraph" w:styleId="Titre6">
     <w:name w:val="heading 6"/>
     <w:basedOn w:val="Normal"/>
     <w:next w:val="Normal"/>
-    <w:link w:val="Heading6Char"/>
+    <w:link w:val="Titre6Car"/>
     <w:uiPriority w:val="9"/>
     <w:semiHidden/>
     <w:unhideWhenUsed/>
@@ -2108,11 +2545,11 @@
       <w:color w:val="595959" w:themeColor="text1" w:themeTint="A6"/>
     </w:rPr>
   </w:style>
-  <w:style w:type="paragraph" w:styleId="Heading7">
+  <w:style w:type="paragraph" w:styleId="Titre7">
     <w:name w:val="heading 7"/>
     <w:basedOn w:val="Normal"/>
     <w:next w:val="Normal"/>
-    <w:link w:val="Heading7Char"/>
+    <w:link w:val="Titre7Car"/>
     <w:uiPriority w:val="9"/>
     <w:semiHidden/>
     <w:unhideWhenUsed/>
@@ -2129,11 +2566,11 @@
       <w:color w:val="595959" w:themeColor="text1" w:themeTint="A6"/>
     </w:rPr>
   </w:style>
-  <w:style w:type="paragraph" w:styleId="Heading8">
+  <w:style w:type="paragraph" w:styleId="Titre8">
     <w:name w:val="heading 8"/>
     <w:basedOn w:val="Normal"/>
     <w:next w:val="Normal"/>
-    <w:link w:val="Heading8Char"/>
+    <w:link w:val="Titre8Car"/>
     <w:uiPriority w:val="9"/>
     <w:semiHidden/>
     <w:unhideWhenUsed/>
@@ -2152,11 +2589,11 @@
       <w:color w:val="272727" w:themeColor="text1" w:themeTint="D8"/>
     </w:rPr>
   </w:style>
-  <w:style w:type="paragraph" w:styleId="Heading9">
+  <w:style w:type="paragraph" w:styleId="Titre9">
     <w:name w:val="heading 9"/>
     <w:basedOn w:val="Normal"/>
     <w:next w:val="Normal"/>
-    <w:link w:val="Heading9Char"/>
+    <w:link w:val="Titre9Car"/>
     <w:uiPriority w:val="9"/>
     <w:semiHidden/>
     <w:unhideWhenUsed/>
@@ -2173,12 +2610,13 @@
       <w:color w:val="272727" w:themeColor="text1" w:themeTint="D8"/>
     </w:rPr>
   </w:style>
-  <w:style w:type="character" w:default="1" w:styleId="DefaultParagraphFont">
+  <w:style w:type="character" w:default="1" w:styleId="Policepardfaut">
     <w:name w:val="Default Paragraph Font"/>
     <w:uiPriority w:val="1"/>
+    <w:semiHidden/>
     <w:unhideWhenUsed/>
   </w:style>
-  <w:style w:type="table" w:default="1" w:styleId="TableNormal">
+  <w:style w:type="table" w:default="1" w:styleId="TableauNormal">
     <w:name w:val="Normal Table"/>
     <w:uiPriority w:val="99"/>
     <w:semiHidden/>
@@ -2193,16 +2631,16 @@
       </w:tblCellMar>
     </w:tblPr>
   </w:style>
-  <w:style w:type="numbering" w:default="1" w:styleId="NoList">
+  <w:style w:type="numbering" w:default="1" w:styleId="Aucuneliste">
     <w:name w:val="No List"/>
     <w:uiPriority w:val="99"/>
     <w:semiHidden/>
     <w:unhideWhenUsed/>
   </w:style>
-  <w:style w:type="character" w:customStyle="1" w:styleId="Heading1Char">
-    <w:name w:val="Heading 1 Char"/>
-    <w:basedOn w:val="DefaultParagraphFont"/>
-    <w:link w:val="Heading1"/>
+  <w:style w:type="character" w:customStyle="1" w:styleId="Titre1Car">
+    <w:name w:val="Titre 1 Car"/>
+    <w:basedOn w:val="Policepardfaut"/>
+    <w:link w:val="Titre1"/>
     <w:uiPriority w:val="9"/>
     <w:rsid w:val="00515B29"/>
     <w:rPr>
@@ -2212,10 +2650,10 @@
       <w:szCs w:val="40"/>
     </w:rPr>
   </w:style>
-  <w:style w:type="character" w:customStyle="1" w:styleId="Heading2Char">
-    <w:name w:val="Heading 2 Char"/>
-    <w:basedOn w:val="DefaultParagraphFont"/>
-    <w:link w:val="Heading2"/>
+  <w:style w:type="character" w:customStyle="1" w:styleId="Titre2Car">
+    <w:name w:val="Titre 2 Car"/>
+    <w:basedOn w:val="Policepardfaut"/>
+    <w:link w:val="Titre2"/>
     <w:uiPriority w:val="9"/>
     <w:semiHidden/>
     <w:rsid w:val="00515B29"/>
@@ -2226,10 +2664,10 @@
       <w:szCs w:val="32"/>
     </w:rPr>
   </w:style>
-  <w:style w:type="character" w:customStyle="1" w:styleId="Heading3Char">
-    <w:name w:val="Heading 3 Char"/>
-    <w:basedOn w:val="DefaultParagraphFont"/>
-    <w:link w:val="Heading3"/>
+  <w:style w:type="character" w:customStyle="1" w:styleId="Titre3Car">
+    <w:name w:val="Titre 3 Car"/>
+    <w:basedOn w:val="Policepardfaut"/>
+    <w:link w:val="Titre3"/>
     <w:uiPriority w:val="9"/>
     <w:semiHidden/>
     <w:rsid w:val="00515B29"/>
@@ -2240,10 +2678,10 @@
       <w:szCs w:val="28"/>
     </w:rPr>
   </w:style>
-  <w:style w:type="character" w:customStyle="1" w:styleId="Heading4Char">
-    <w:name w:val="Heading 4 Char"/>
-    <w:basedOn w:val="DefaultParagraphFont"/>
-    <w:link w:val="Heading4"/>
+  <w:style w:type="character" w:customStyle="1" w:styleId="Titre4Car">
+    <w:name w:val="Titre 4 Car"/>
+    <w:basedOn w:val="Policepardfaut"/>
+    <w:link w:val="Titre4"/>
     <w:uiPriority w:val="9"/>
     <w:semiHidden/>
     <w:rsid w:val="00515B29"/>
@@ -2254,10 +2692,10 @@
       <w:color w:val="0F4761" w:themeColor="accent1" w:themeShade="BF"/>
     </w:rPr>
   </w:style>
-  <w:style w:type="character" w:customStyle="1" w:styleId="Heading5Char">
-    <w:name w:val="Heading 5 Char"/>
-    <w:basedOn w:val="DefaultParagraphFont"/>
-    <w:link w:val="Heading5"/>
+  <w:style w:type="character" w:customStyle="1" w:styleId="Titre5Car">
+    <w:name w:val="Titre 5 Car"/>
+    <w:basedOn w:val="Policepardfaut"/>
+    <w:link w:val="Titre5"/>
     <w:uiPriority w:val="9"/>
     <w:semiHidden/>
     <w:rsid w:val="00515B29"/>
@@ -2266,10 +2704,10 @@
       <w:color w:val="0F4761" w:themeColor="accent1" w:themeShade="BF"/>
     </w:rPr>
   </w:style>
-  <w:style w:type="character" w:customStyle="1" w:styleId="Heading6Char">
-    <w:name w:val="Heading 6 Char"/>
-    <w:basedOn w:val="DefaultParagraphFont"/>
-    <w:link w:val="Heading6"/>
+  <w:style w:type="character" w:customStyle="1" w:styleId="Titre6Car">
+    <w:name w:val="Titre 6 Car"/>
+    <w:basedOn w:val="Policepardfaut"/>
+    <w:link w:val="Titre6"/>
     <w:uiPriority w:val="9"/>
     <w:semiHidden/>
     <w:rsid w:val="00515B29"/>
@@ -2280,10 +2718,10 @@
       <w:color w:val="595959" w:themeColor="text1" w:themeTint="A6"/>
     </w:rPr>
   </w:style>
-  <w:style w:type="character" w:customStyle="1" w:styleId="Heading7Char">
-    <w:name w:val="Heading 7 Char"/>
-    <w:basedOn w:val="DefaultParagraphFont"/>
-    <w:link w:val="Heading7"/>
+  <w:style w:type="character" w:customStyle="1" w:styleId="Titre7Car">
+    <w:name w:val="Titre 7 Car"/>
+    <w:basedOn w:val="Policepardfaut"/>
+    <w:link w:val="Titre7"/>
     <w:uiPriority w:val="9"/>
     <w:semiHidden/>
     <w:rsid w:val="00515B29"/>
@@ -2292,10 +2730,10 @@
       <w:color w:val="595959" w:themeColor="text1" w:themeTint="A6"/>
     </w:rPr>
   </w:style>
-  <w:style w:type="character" w:customStyle="1" w:styleId="Heading8Char">
-    <w:name w:val="Heading 8 Char"/>
-    <w:basedOn w:val="DefaultParagraphFont"/>
-    <w:link w:val="Heading8"/>
+  <w:style w:type="character" w:customStyle="1" w:styleId="Titre8Car">
+    <w:name w:val="Titre 8 Car"/>
+    <w:basedOn w:val="Policepardfaut"/>
+    <w:link w:val="Titre8"/>
     <w:uiPriority w:val="9"/>
     <w:semiHidden/>
     <w:rsid w:val="00515B29"/>
@@ -2306,10 +2744,10 @@
       <w:color w:val="272727" w:themeColor="text1" w:themeTint="D8"/>
     </w:rPr>
   </w:style>
-  <w:style w:type="character" w:customStyle="1" w:styleId="Heading9Char">
-    <w:name w:val="Heading 9 Char"/>
-    <w:basedOn w:val="DefaultParagraphFont"/>
-    <w:link w:val="Heading9"/>
+  <w:style w:type="character" w:customStyle="1" w:styleId="Titre9Car">
+    <w:name w:val="Titre 9 Car"/>
+    <w:basedOn w:val="Policepardfaut"/>
+    <w:link w:val="Titre9"/>
     <w:uiPriority w:val="9"/>
     <w:semiHidden/>
     <w:rsid w:val="00515B29"/>
@@ -2318,11 +2756,11 @@
       <w:color w:val="272727" w:themeColor="text1" w:themeTint="D8"/>
     </w:rPr>
   </w:style>
-  <w:style w:type="paragraph" w:styleId="Title">
+  <w:style w:type="paragraph" w:styleId="Titre">
     <w:name w:val="Title"/>
     <w:basedOn w:val="Normal"/>
     <w:next w:val="Normal"/>
-    <w:link w:val="TitleChar"/>
+    <w:link w:val="TitreCar"/>
     <w:uiPriority w:val="10"/>
     <w:qFormat/>
     <w:rsid w:val="00515B29"/>
@@ -2338,10 +2776,10 @@
       <w:szCs w:val="56"/>
     </w:rPr>
   </w:style>
-  <w:style w:type="character" w:customStyle="1" w:styleId="TitleChar">
-    <w:name w:val="Title Char"/>
-    <w:basedOn w:val="DefaultParagraphFont"/>
-    <w:link w:val="Title"/>
+  <w:style w:type="character" w:customStyle="1" w:styleId="TitreCar">
+    <w:name w:val="Titre Car"/>
+    <w:basedOn w:val="Policepardfaut"/>
+    <w:link w:val="Titre"/>
     <w:uiPriority w:val="10"/>
     <w:rsid w:val="00515B29"/>
     <w:rPr>
@@ -2352,11 +2790,11 @@
       <w:szCs w:val="56"/>
     </w:rPr>
   </w:style>
-  <w:style w:type="paragraph" w:styleId="Subtitle">
+  <w:style w:type="paragraph" w:styleId="Sous-titre">
     <w:name w:val="Subtitle"/>
     <w:basedOn w:val="Normal"/>
     <w:next w:val="Normal"/>
-    <w:link w:val="SubtitleChar"/>
+    <w:link w:val="Sous-titreCar"/>
     <w:uiPriority w:val="11"/>
     <w:qFormat/>
     <w:rsid w:val="00515B29"/>
@@ -2373,10 +2811,10 @@
       <w:szCs w:val="28"/>
     </w:rPr>
   </w:style>
-  <w:style w:type="character" w:customStyle="1" w:styleId="SubtitleChar">
-    <w:name w:val="Subtitle Char"/>
-    <w:basedOn w:val="DefaultParagraphFont"/>
-    <w:link w:val="Subtitle"/>
+  <w:style w:type="character" w:customStyle="1" w:styleId="Sous-titreCar">
+    <w:name w:val="Sous-titre Car"/>
+    <w:basedOn w:val="Policepardfaut"/>
+    <w:link w:val="Sous-titre"/>
     <w:uiPriority w:val="11"/>
     <w:rsid w:val="00515B29"/>
     <w:rPr>
@@ -2387,11 +2825,11 @@
       <w:szCs w:val="28"/>
     </w:rPr>
   </w:style>
-  <w:style w:type="paragraph" w:styleId="Quote">
+  <w:style w:type="paragraph" w:styleId="Citation">
     <w:name w:val="Quote"/>
     <w:basedOn w:val="Normal"/>
     <w:next w:val="Normal"/>
-    <w:link w:val="QuoteChar"/>
+    <w:link w:val="CitationCar"/>
     <w:uiPriority w:val="29"/>
     <w:qFormat/>
     <w:rsid w:val="00515B29"/>
@@ -2405,10 +2843,10 @@
       <w:color w:val="404040" w:themeColor="text1" w:themeTint="BF"/>
     </w:rPr>
   </w:style>
-  <w:style w:type="character" w:customStyle="1" w:styleId="QuoteChar">
-    <w:name w:val="Quote Char"/>
-    <w:basedOn w:val="DefaultParagraphFont"/>
-    <w:link w:val="Quote"/>
+  <w:style w:type="character" w:customStyle="1" w:styleId="CitationCar">
+    <w:name w:val="Citation Car"/>
+    <w:basedOn w:val="Policepardfaut"/>
+    <w:link w:val="Citation"/>
     <w:uiPriority w:val="29"/>
     <w:rsid w:val="00515B29"/>
     <w:rPr>
@@ -2417,7 +2855,7 @@
       <w:color w:val="404040" w:themeColor="text1" w:themeTint="BF"/>
     </w:rPr>
   </w:style>
-  <w:style w:type="paragraph" w:styleId="ListParagraph">
+  <w:style w:type="paragraph" w:styleId="Paragraphedeliste">
     <w:name w:val="List Paragraph"/>
     <w:basedOn w:val="Normal"/>
     <w:uiPriority w:val="34"/>
@@ -2428,9 +2866,9 @@
       <w:contextualSpacing/>
     </w:pPr>
   </w:style>
-  <w:style w:type="character" w:styleId="IntenseEmphasis">
+  <w:style w:type="character" w:styleId="Accentuationintense">
     <w:name w:val="Intense Emphasis"/>
-    <w:basedOn w:val="DefaultParagraphFont"/>
+    <w:basedOn w:val="Policepardfaut"/>
     <w:uiPriority w:val="21"/>
     <w:qFormat/>
     <w:rsid w:val="00515B29"/>
@@ -2440,11 +2878,11 @@
       <w:color w:val="0F4761" w:themeColor="accent1" w:themeShade="BF"/>
     </w:rPr>
   </w:style>
-  <w:style w:type="paragraph" w:styleId="IntenseQuote">
+  <w:style w:type="paragraph" w:styleId="Citationintense">
     <w:name w:val="Intense Quote"/>
     <w:basedOn w:val="Normal"/>
     <w:next w:val="Normal"/>
-    <w:link w:val="IntenseQuoteChar"/>
+    <w:link w:val="CitationintenseCar"/>
     <w:uiPriority w:val="30"/>
     <w:qFormat/>
     <w:rsid w:val="00515B29"/>
@@ -2463,10 +2901,10 @@
       <w:color w:val="0F4761" w:themeColor="accent1" w:themeShade="BF"/>
     </w:rPr>
   </w:style>
-  <w:style w:type="character" w:customStyle="1" w:styleId="IntenseQuoteChar">
-    <w:name w:val="Intense Quote Char"/>
-    <w:basedOn w:val="DefaultParagraphFont"/>
-    <w:link w:val="IntenseQuote"/>
+  <w:style w:type="character" w:customStyle="1" w:styleId="CitationintenseCar">
+    <w:name w:val="Citation intense Car"/>
+    <w:basedOn w:val="Policepardfaut"/>
+    <w:link w:val="Citationintense"/>
     <w:uiPriority w:val="30"/>
     <w:rsid w:val="00515B29"/>
     <w:rPr>
@@ -2475,9 +2913,9 @@
       <w:color w:val="0F4761" w:themeColor="accent1" w:themeShade="BF"/>
     </w:rPr>
   </w:style>
-  <w:style w:type="character" w:styleId="IntenseReference">
+  <w:style w:type="character" w:styleId="Rfrenceintense">
     <w:name w:val="Intense Reference"/>
-    <w:basedOn w:val="DefaultParagraphFont"/>
+    <w:basedOn w:val="Policepardfaut"/>
     <w:uiPriority w:val="32"/>
     <w:qFormat/>
     <w:rsid w:val="00515B29"/>

</xml_diff>

<commit_message>
Ajustement du schéma de la pipeline d'ETL
</commit_message>
<xml_diff>
--- a/Rapport.docx
+++ b/Rapport.docx
@@ -1058,27 +1058,7 @@
           <w:lang w:eastAsia="fr-CA"/>
           <w14:ligatures w14:val="none"/>
         </w:rPr>
-        <w:t xml:space="preserve"> : Les données transformées des </w:t>
-      </w:r>
-      <w:proofErr w:type="gramStart"/>
-      <w:r>
-        <w:rPr>
-          <w:rFonts w:ascii="Times New Roman" w:eastAsia="Times New Roman" w:hAnsi="Times New Roman" w:cs="Times New Roman"/>
-          <w:kern w:val="0"/>
-          <w:lang w:eastAsia="fr-CA"/>
-          <w14:ligatures w14:val="none"/>
-        </w:rPr>
-        <w:t>restaurants</w:t>
-      </w:r>
-      <w:proofErr w:type="gramEnd"/>
-      <w:r>
-        <w:rPr>
-          <w:rFonts w:ascii="Times New Roman" w:eastAsia="Times New Roman" w:hAnsi="Times New Roman" w:cs="Times New Roman"/>
-          <w:kern w:val="0"/>
-          <w:lang w:eastAsia="fr-CA"/>
-          <w14:ligatures w14:val="none"/>
-        </w:rPr>
-        <w:t xml:space="preserve"> sont chargées dans MongoDB pour permettre des recherches et des analyses rapides sur les options de restauration.</w:t>
+        <w:t xml:space="preserve"> : Les données transformées des restaurants sont chargées dans MongoDB pour permettre des recherches et des analyses rapides sur les options de restauration.</w:t>
       </w:r>
     </w:p>
     <w:p>
@@ -1561,10 +1541,10 @@
           <w:noProof/>
         </w:rPr>
         <w:drawing>
-          <wp:inline distT="0" distB="0" distL="0" distR="0" wp14:anchorId="410D6CA7" wp14:editId="2CFF76EA">
+          <wp:inline distT="0" distB="0" distL="0" distR="0" wp14:anchorId="0417CA60" wp14:editId="2CDFC00B">
             <wp:extent cx="5486400" cy="4860925"/>
             <wp:effectExtent l="0" t="0" r="0" b="0"/>
-            <wp:docPr id="1164645789" name="Image 2"/>
+            <wp:docPr id="337463993" name="Image 1"/>
             <wp:cNvGraphicFramePr>
               <a:graphicFrameLocks xmlns:a="http://schemas.openxmlformats.org/drawingml/2006/main" noChangeAspect="1"/>
             </wp:cNvGraphicFramePr>
@@ -1572,7 +1552,7 @@
               <a:graphicData uri="http://schemas.openxmlformats.org/drawingml/2006/picture">
                 <pic:pic xmlns:pic="http://schemas.openxmlformats.org/drawingml/2006/picture">
                   <pic:nvPicPr>
-                    <pic:cNvPr id="1164645789" name="Image 1164645789"/>
+                    <pic:cNvPr id="337463993" name="Image 337463993"/>
                     <pic:cNvPicPr/>
                   </pic:nvPicPr>
                   <pic:blipFill>

</xml_diff>

<commit_message>
compléter partie réplication section 6 du rapport
</commit_message>
<xml_diff>
--- a/Rapport.docx
+++ b/Rapport.docx
@@ -3887,16 +3887,7 @@
         <w:t xml:space="preserve"> impact sur le volume de données à emmagasiner. En ce sens, la région de Normandie possède une quantité importante de pistes cyclables : « </w:t>
       </w:r>
       <w:r>
-        <w:t xml:space="preserve">Une fréquentation qui reflète l’attractivité des 1 700 km de </w:t>
-      </w:r>
-      <w:r>
-        <w:t>véloroutes</w:t>
-      </w:r>
-      <w:r>
-        <w:t xml:space="preserve"> que compte la région</w:t>
-      </w:r>
-      <w:r>
-        <w:t>.</w:t>
+        <w:t>Une fréquentation qui reflète l’attractivité des 1 700 km de véloroutes que compte la région.</w:t>
       </w:r>
       <w:r>
         <w:t xml:space="preserve"> »</w:t>
@@ -3920,7 +3911,13 @@
         <w:footnoteReference w:id="4"/>
       </w:r>
       <w:r>
-        <w:t xml:space="preserve"> . Ainsi, nous prévoyons un doublement des données de notre application autant pour les restaurants de MongoDB que pour les pistes cyclables de Neo4J.</w:t>
+        <w:t xml:space="preserve"> . Ainsi, nous prévoyons un </w:t>
+      </w:r>
+      <w:r>
+        <w:t>dé</w:t>
+      </w:r>
+      <w:r>
+        <w:t>doublement des données de notre application autant pour les restaurants de MongoDB que pour les pistes cyclables de Neo4J.</w:t>
       </w:r>
     </w:p>
     <w:p>
@@ -3929,17 +3926,22 @@
       </w:pPr>
       <w:bookmarkStart w:id="18" w:name="_Toc183852575"/>
       <w:r>
+        <w:t>Réplication</w:t>
+      </w:r>
+      <w:bookmarkEnd w:id="18"/>
+    </w:p>
+    <w:p>
+      <w:r>
+        <w:t>Afin d’améliorer l’extensibilité et la fiabilité de notre application, nous utiliserons une réplication maître-esclave. Ainsi, notre système sera composé d’un nœud primaire (le maître) et de nœuds secondaires (les esclaves) qui répliquerons le nœud primaire. Par conséquent, cela pourrait réduire considérablement le taux RPS en distribuant les lectures sur plusieurs instances de notre base de données et, par le fait même, la latence de notre application.</w:t>
+      </w:r>
+    </w:p>
+    <w:p>
+      <w:pPr>
+        <w:pStyle w:val="Titre2"/>
+      </w:pPr>
+      <w:bookmarkStart w:id="19" w:name="_Toc183852576"/>
+      <w:r>
         <w:lastRenderedPageBreak/>
-        <w:t>Réplication</w:t>
-      </w:r>
-      <w:bookmarkEnd w:id="18"/>
-    </w:p>
-    <w:p>
-      <w:pPr>
-        <w:pStyle w:val="Titre2"/>
-      </w:pPr>
-      <w:bookmarkStart w:id="19" w:name="_Toc183852576"/>
-      <w:r>
         <w:t>Partitionnement</w:t>
       </w:r>
       <w:bookmarkEnd w:id="19"/>
@@ -4186,22 +4188,28 @@
       </w:pPr>
       <w:bookmarkStart w:id="25" w:name="_Toc183852582"/>
       <w:r>
+        <w:t>Annexe 4</w:t>
+      </w:r>
+      <w:bookmarkEnd w:id="25"/>
+    </w:p>
+    <w:p>
+      <w:pPr>
+        <w:rPr>
+          <w:rFonts w:ascii="Arial" w:hAnsi="Arial" w:cs="Arial"/>
+        </w:rPr>
+      </w:pPr>
+      <w:r>
+        <w:rPr>
+          <w:rFonts w:ascii="Arial" w:hAnsi="Arial" w:cs="Arial"/>
+        </w:rPr>
+        <w:t xml:space="preserve">Exemple d’objet JSON retourné par une requête de format similaire à celle présentée à l’Annexe 2 (les champs distance (en mètres) et duration (en </w:t>
+      </w:r>
+      <w:r>
+        <w:rPr>
+          <w:rFonts w:ascii="Arial" w:hAnsi="Arial" w:cs="Arial"/>
+        </w:rPr>
         <w:lastRenderedPageBreak/>
-        <w:t>Annexe 4</w:t>
-      </w:r>
-      <w:bookmarkEnd w:id="25"/>
-    </w:p>
-    <w:p>
-      <w:pPr>
-        <w:rPr>
-          <w:rFonts w:ascii="Arial" w:hAnsi="Arial" w:cs="Arial"/>
-        </w:rPr>
-      </w:pPr>
-      <w:r>
-        <w:rPr>
-          <w:rFonts w:ascii="Arial" w:hAnsi="Arial" w:cs="Arial"/>
-        </w:rPr>
-        <w:t>Exemple d’objet JSON retourné par une requête de format similaire à celle présentée à l’Annexe 2 (les champs distance (en mètres) et duration (en secondes) correspondent aux détails du trajet global, le champ concaténé “steps” énumère les différentes étapes du trajet avec instruction de déplacement progressive)</w:t>
+        <w:t>secondes) correspondent aux détails du trajet global, le champ concaténé “steps” énumère les différentes étapes du trajet avec instruction de déplacement progressive)</w:t>
       </w:r>
     </w:p>
     <w:p>
@@ -6270,6 +6278,7 @@
   <w:style w:type="character" w:default="1" w:styleId="Policepardfaut">
     <w:name w:val="Default Paragraph Font"/>
     <w:uiPriority w:val="1"/>
+    <w:semiHidden/>
     <w:unhideWhenUsed/>
   </w:style>
   <w:style w:type="table" w:default="1" w:styleId="TableauNormal">

</xml_diff>

<commit_message>
Ajout de la partie sécurité de la section 6 du rapport
</commit_message>
<xml_diff>
--- a/Rapport.docx
+++ b/Rapport.docx
@@ -3957,6 +3957,32 @@
       <w:bookmarkEnd w:id="20"/>
     </w:p>
     <w:p>
+      <w:r>
+        <w:t xml:space="preserve">Un utilisateur pourra se connecter à notre application pour rechercher un itinéraire à vélo permettant des arrêts dans divers restaurants. L’application devra alors interroger la base de données MongoDB pour obtenir des informations sur les restaurants et Neo4J pour calculer les trajets via les pistes cyclables. Afin d’éviter que l’utilisateur puisse exploiter une faille pour injecter des requêtes malveillantes et corrompre les données, il pourrait être judicieux d’implémenter une validation stricte des entrées utilisateurs. Par exemple, nous pourrions vérifier le format des coordonnées géographiques ou encore spécifier les mots-clés autorisés. Dans le cas de Neo4J, nous pourrions utiliser des paramètres dans les requêtes </w:t>
+      </w:r>
+      <w:r>
+        <w:rPr>
+          <w:i/>
+          <w:iCs/>
+        </w:rPr>
+        <w:t>Cypher</w:t>
+      </w:r>
+      <w:r>
+        <w:t>.</w:t>
+      </w:r>
+    </w:p>
+    <w:p>
+      <w:r>
+        <w:t>Un administrateur pourra ajouter de nouveaux restaurants ou de nouvelles pistes cyclables à nos bases de données. Celui-ci pourra insérer de nouveaux documents dans MongoDB et créer de nouveaux nœuds et/ou relations dans Neo4J.</w:t>
+      </w:r>
+      <w:r>
+        <w:t xml:space="preserve"> Afin d’éviter qu’un individu mal intentionné puisse exploiter les identifiants d’un administrateur pour manipuler ou supprimer des données critiques, il pourrait être intéressant de mettre en place un contrôle d’accès basé sur les rôles. Par exemple, nous pourrions restreindre l’accès en écriture aux différents documents de notre base de données MongoDB. Par ailleurs, l’erreur étant humaine, un administrateur pourrait ajouter des données incorrectes ou supprimer des données importantes par inattention. Afin de limiter les conséquences de telles erreurs, il pourrait être judicieux encore une fois de limiter les permissions de l’administrateur par l’utilisation des rôles dans le cas de MongoDB et en mettant en place des sauvegardes automatiques des bases de données à intervalles réguliers</w:t>
+      </w:r>
+      <w:r>
+        <w:t xml:space="preserve"> ce qui nous permettra de restaurer le système en cas de problème majeur.</w:t>
+      </w:r>
+    </w:p>
+    <w:p>
       <w:pPr>
         <w:pStyle w:val="Titre1"/>
       </w:pPr>
@@ -3999,6 +4025,7 @@
         <w:rPr>
           <w:noProof/>
         </w:rPr>
+        <w:lastRenderedPageBreak/>
         <w:drawing>
           <wp:inline distT="0" distB="0" distL="0" distR="0" wp14:anchorId="03EB87C2" wp14:editId="7DC3CC74">
             <wp:extent cx="5486400" cy="1138555"/>
@@ -4202,26 +4229,20 @@
         <w:rPr>
           <w:rFonts w:ascii="Arial" w:hAnsi="Arial" w:cs="Arial"/>
         </w:rPr>
-        <w:t xml:space="preserve">Exemple d’objet JSON retourné par une requête de format similaire à celle présentée à l’Annexe 2 (les champs distance (en mètres) et duration (en </w:t>
-      </w:r>
-      <w:r>
-        <w:rPr>
-          <w:rFonts w:ascii="Arial" w:hAnsi="Arial" w:cs="Arial"/>
+        <w:t>Exemple d’objet JSON retourné par une requête de format similaire à celle présentée à l’Annexe 2 (les champs distance (en mètres) et duration (en secondes) correspondent aux détails du trajet global, le champ concaténé “steps” énumère les différentes étapes du trajet avec instruction de déplacement progressive)</w:t>
+      </w:r>
+    </w:p>
+    <w:p>
+      <w:pPr>
+        <w:rPr>
+          <w:rFonts w:ascii="Arial" w:hAnsi="Arial" w:cs="Arial"/>
+        </w:rPr>
+      </w:pPr>
+      <w:r>
+        <w:rPr>
+          <w:noProof/>
         </w:rPr>
         <w:lastRenderedPageBreak/>
-        <w:t>secondes) correspondent aux détails du trajet global, le champ concaténé “steps” énumère les différentes étapes du trajet avec instruction de déplacement progressive)</w:t>
-      </w:r>
-    </w:p>
-    <w:p>
-      <w:pPr>
-        <w:rPr>
-          <w:rFonts w:ascii="Arial" w:hAnsi="Arial" w:cs="Arial"/>
-        </w:rPr>
-      </w:pPr>
-      <w:r>
-        <w:rPr>
-          <w:noProof/>
-        </w:rPr>
         <w:drawing>
           <wp:inline distT="0" distB="0" distL="0" distR="0" wp14:anchorId="219648A8" wp14:editId="1D6E2954">
             <wp:extent cx="5486400" cy="3696970"/>
@@ -4366,7 +4387,6 @@
         <w:rPr>
           <w:noProof/>
         </w:rPr>
-        <w:lastRenderedPageBreak/>
         <w:drawing>
           <wp:inline distT="0" distB="0" distL="0" distR="0" wp14:anchorId="1FB02EF4" wp14:editId="45060A73">
             <wp:extent cx="5337810" cy="1371600"/>
@@ -4412,6 +4432,7 @@
       </w:pPr>
       <w:bookmarkStart w:id="28" w:name="_Toc183852585"/>
       <w:r>
+        <w:lastRenderedPageBreak/>
         <w:t>Annexe 7</w:t>
       </w:r>
       <w:bookmarkEnd w:id="28"/>
@@ -4655,7 +4676,6 @@
         <w:rPr>
           <w:noProof/>
         </w:rPr>
-        <w:lastRenderedPageBreak/>
         <w:drawing>
           <wp:inline distT="0" distB="0" distL="0" distR="0" wp14:anchorId="23F6352E" wp14:editId="3762F12A">
             <wp:extent cx="5486400" cy="628650"/>
@@ -4730,6 +4750,7 @@
         <w:rPr>
           <w:noProof/>
         </w:rPr>
+        <w:lastRenderedPageBreak/>
         <w:drawing>
           <wp:inline distT="0" distB="0" distL="0" distR="0" wp14:anchorId="69CAAEB9" wp14:editId="1F9DE093">
             <wp:extent cx="5486400" cy="520065"/>

</xml_diff>

<commit_message>
Ajout de la partie partitionnement dans le rapport
</commit_message>
<xml_diff>
--- a/Rapport.docx
+++ b/Rapport.docx
@@ -219,7 +219,21 @@
         <w:rPr>
           <w:rFonts w:ascii="Arial" w:hAnsi="Arial" w:cs="Arial"/>
         </w:rPr>
-        <w:t>Christian Fosso (536 904 549)</w:t>
+        <w:t xml:space="preserve">Christian </w:t>
+      </w:r>
+      <w:proofErr w:type="spellStart"/>
+      <w:r>
+        <w:rPr>
+          <w:rFonts w:ascii="Arial" w:hAnsi="Arial" w:cs="Arial"/>
+        </w:rPr>
+        <w:t>Fosso</w:t>
+      </w:r>
+      <w:proofErr w:type="spellEnd"/>
+      <w:r>
+        <w:rPr>
+          <w:rFonts w:ascii="Arial" w:hAnsi="Arial" w:cs="Arial"/>
+        </w:rPr>
+        <w:t xml:space="preserve"> (536 904 549)</w:t>
       </w:r>
     </w:p>
     <w:p>
@@ -244,30 +258,40 @@
           <w:szCs w:val="48"/>
         </w:rPr>
       </w:pPr>
+      <w:proofErr w:type="spellStart"/>
       <w:r>
         <w:rPr>
           <w:rFonts w:ascii="Arial" w:hAnsi="Arial" w:cs="Arial"/>
           <w:sz w:val="48"/>
           <w:szCs w:val="48"/>
         </w:rPr>
-        <w:t>Dérisquer l’application</w:t>
-      </w:r>
-    </w:p>
-    <w:p>
-      <w:pPr>
-        <w:jc w:val="center"/>
+        <w:t>Dérisquer</w:t>
+      </w:r>
+      <w:proofErr w:type="spellEnd"/>
+      <w:r>
         <w:rPr>
           <w:rFonts w:ascii="Arial" w:hAnsi="Arial" w:cs="Arial"/>
           <w:sz w:val="48"/>
           <w:szCs w:val="48"/>
         </w:rPr>
-      </w:pPr>
+        <w:t xml:space="preserve"> l’application</w:t>
+      </w:r>
     </w:p>
     <w:p>
       <w:pPr>
         <w:jc w:val="center"/>
         <w:rPr>
           <w:rFonts w:ascii="Arial" w:hAnsi="Arial" w:cs="Arial"/>
+          <w:sz w:val="48"/>
+          <w:szCs w:val="48"/>
+        </w:rPr>
+      </w:pPr>
+    </w:p>
+    <w:p>
+      <w:pPr>
+        <w:jc w:val="center"/>
+        <w:rPr>
+          <w:rFonts w:ascii="Arial" w:hAnsi="Arial" w:cs="Arial"/>
         </w:rPr>
       </w:pPr>
       <w:r>
@@ -284,11 +308,19 @@
           <w:rFonts w:ascii="Arial" w:hAnsi="Arial" w:cs="Arial"/>
         </w:rPr>
       </w:pPr>
-      <w:r>
-        <w:rPr>
-          <w:rFonts w:ascii="Arial" w:hAnsi="Arial" w:cs="Arial"/>
-        </w:rPr>
-        <w:t>Eloïse Prévôt</w:t>
+      <w:proofErr w:type="spellStart"/>
+      <w:r>
+        <w:rPr>
+          <w:rFonts w:ascii="Arial" w:hAnsi="Arial" w:cs="Arial"/>
+        </w:rPr>
+        <w:t>Eloïse</w:t>
+      </w:r>
+      <w:proofErr w:type="spellEnd"/>
+      <w:r>
+        <w:rPr>
+          <w:rFonts w:ascii="Arial" w:hAnsi="Arial" w:cs="Arial"/>
+        </w:rPr>
+        <w:t xml:space="preserve"> Prévôt</w:t>
       </w:r>
     </w:p>
     <w:p>
@@ -3211,7 +3243,49 @@
         <w:rPr>
           <w:rFonts w:ascii="Arial" w:hAnsi="Arial" w:cs="Arial"/>
         </w:rPr>
-        <w:t>Les données géospatiales utilisées pour ce projet seront récupérées de OpenStreetMap (OSM). C’est une base de données open source qui fournit beaucoup d’informations détaillées sur les routes et points d’intérêts à partir d’une localisation. Grâce au langage de programmation utilisé qui sera présenté plus bas, nous pouvons utiliser la bibliothèque “osmnx” pour récupérer les coordonnées des restaurants de la ville. Nous allons par la suite récupérer à partir de OpenRouteService les itinéraires optimaux à vélo entre deux coordonnées géospatiales, qui combiné avec OSM nous permettra d’obtenir toutes les données nécessaires.</w:t>
+        <w:t xml:space="preserve">Les données géospatiales utilisées pour ce projet seront récupérées de </w:t>
+      </w:r>
+      <w:proofErr w:type="spellStart"/>
+      <w:r>
+        <w:rPr>
+          <w:rFonts w:ascii="Arial" w:hAnsi="Arial" w:cs="Arial"/>
+        </w:rPr>
+        <w:t>OpenStreetMap</w:t>
+      </w:r>
+      <w:proofErr w:type="spellEnd"/>
+      <w:r>
+        <w:rPr>
+          <w:rFonts w:ascii="Arial" w:hAnsi="Arial" w:cs="Arial"/>
+        </w:rPr>
+        <w:t xml:space="preserve"> (OSM). C’est une base de données open source qui fournit beaucoup d’informations détaillées sur les routes et points d’intérêts à partir d’une localisation. Grâce au langage de programmation utilisé qui sera présenté plus bas, nous pouvons utiliser la bibliothèque “</w:t>
+      </w:r>
+      <w:proofErr w:type="spellStart"/>
+      <w:r>
+        <w:rPr>
+          <w:rFonts w:ascii="Arial" w:hAnsi="Arial" w:cs="Arial"/>
+        </w:rPr>
+        <w:t>osmnx</w:t>
+      </w:r>
+      <w:proofErr w:type="spellEnd"/>
+      <w:r>
+        <w:rPr>
+          <w:rFonts w:ascii="Arial" w:hAnsi="Arial" w:cs="Arial"/>
+        </w:rPr>
+        <w:t xml:space="preserve">” pour récupérer les coordonnées des restaurants de la ville. Nous allons par la suite récupérer à partir de </w:t>
+      </w:r>
+      <w:proofErr w:type="spellStart"/>
+      <w:r>
+        <w:rPr>
+          <w:rFonts w:ascii="Arial" w:hAnsi="Arial" w:cs="Arial"/>
+        </w:rPr>
+        <w:t>OpenRouteService</w:t>
+      </w:r>
+      <w:proofErr w:type="spellEnd"/>
+      <w:r>
+        <w:rPr>
+          <w:rFonts w:ascii="Arial" w:hAnsi="Arial" w:cs="Arial"/>
+        </w:rPr>
+        <w:t xml:space="preserve"> les itinéraires optimaux à vélo entre deux coordonnées géospatiales, qui combiné avec OSM nous permettra d’obtenir toutes les données nécessaires.</w:t>
       </w:r>
     </w:p>
     <w:p>
@@ -3235,7 +3309,35 @@
         <w:rPr>
           <w:rFonts w:ascii="Arial" w:hAnsi="Arial" w:cs="Arial"/>
         </w:rPr>
-        <w:t>Pour obtenir les données sur les restaurants, nous utiliserons du code similaire à celui présenté à l’Annexe 1, en appliquant un champ “amenity” à restaurant et en ajustant la ville à Rimouski. Pour obtenir les données des itinéraires de pistes cyclables de la ville, nous utiliserons une requête vers l’API de OpenRouteService similaire à celle présentée en Annexe 2. </w:t>
+        <w:t>Pour obtenir les données sur les restaurants, nous utiliserons du code similaire à celui présenté à l’Annexe 1, en appliquant un champ “</w:t>
+      </w:r>
+      <w:proofErr w:type="spellStart"/>
+      <w:r>
+        <w:rPr>
+          <w:rFonts w:ascii="Arial" w:hAnsi="Arial" w:cs="Arial"/>
+        </w:rPr>
+        <w:t>amenity</w:t>
+      </w:r>
+      <w:proofErr w:type="spellEnd"/>
+      <w:r>
+        <w:rPr>
+          <w:rFonts w:ascii="Arial" w:hAnsi="Arial" w:cs="Arial"/>
+        </w:rPr>
+        <w:t xml:space="preserve">” à restaurant et en ajustant la ville à Rimouski. Pour obtenir les données des itinéraires de pistes cyclables de la ville, nous utiliserons une requête vers l’API de </w:t>
+      </w:r>
+      <w:proofErr w:type="spellStart"/>
+      <w:r>
+        <w:rPr>
+          <w:rFonts w:ascii="Arial" w:hAnsi="Arial" w:cs="Arial"/>
+        </w:rPr>
+        <w:t>OpenRouteService</w:t>
+      </w:r>
+      <w:proofErr w:type="spellEnd"/>
+      <w:r>
+        <w:rPr>
+          <w:rFonts w:ascii="Arial" w:hAnsi="Arial" w:cs="Arial"/>
+        </w:rPr>
+        <w:t xml:space="preserve"> similaire à celle présentée en Annexe 2. </w:t>
       </w:r>
     </w:p>
     <w:p>
@@ -3259,7 +3361,21 @@
         <w:rPr>
           <w:rFonts w:ascii="Arial" w:hAnsi="Arial" w:cs="Arial"/>
         </w:rPr>
-        <w:t>Les données sur les restaurants récupérées seront sous la forme d’un GeoDataFrame à partir duquel il est très simple d’extraire les données géospatiales requises pour la suite ou même d’effectuer des opérations de calcul sur ces données. Pour les itinéraires à vélo, la requête présentée en Annexe 2 (où la clé API est omise intentionnellement) retourne un objet JSON qui contient toutes les informations d’itinéraires nécessaires.</w:t>
+        <w:t xml:space="preserve">Les données sur les restaurants récupérées seront sous la forme d’un </w:t>
+      </w:r>
+      <w:proofErr w:type="spellStart"/>
+      <w:r>
+        <w:rPr>
+          <w:rFonts w:ascii="Arial" w:hAnsi="Arial" w:cs="Arial"/>
+        </w:rPr>
+        <w:t>GeoDataFrame</w:t>
+      </w:r>
+      <w:proofErr w:type="spellEnd"/>
+      <w:r>
+        <w:rPr>
+          <w:rFonts w:ascii="Arial" w:hAnsi="Arial" w:cs="Arial"/>
+        </w:rPr>
+        <w:t xml:space="preserve"> à partir duquel il est très simple d’extraire les données géospatiales requises pour la suite ou même d’effectuer des opérations de calcul sur ces données. Pour les itinéraires à vélo, la requête présentée en Annexe 2 (où la clé API est omise intentionnellement) retourne un objet JSON qui contient toutes les informations d’itinéraires nécessaires.</w:t>
       </w:r>
     </w:p>
     <w:p>
@@ -3326,7 +3442,49 @@
         <w:rPr>
           <w:rFonts w:ascii="Arial" w:hAnsi="Arial" w:cs="Arial"/>
         </w:rPr>
-        <w:t>Pour notre travail longitudinal nous avons décidé d’utiliser Python comme langage de programmation. Ce choix a été adopté notamment pour la simplicité et l'accessibilité de ce dernier qui contribueront à la maintenabilité du système. En ce sens, nous considérons que Python est un outil populaire qui possède une vaste communauté et une documentation abondante ce qui permettra à tous une meilleure autonomie. Par ailleurs, celui-ci permet d’obtenir du code lisible, clair et intuitif ce qui facilitera la compréhension et la communication au sein de l’équipe. De plus, Python peut aussi contribuer à la fiabilité du système. D’une part, il offre un moyen robuste de gérer les exceptions grâce à des blocs try-except ce qui permettra un meilleur contrôle des erreurs. D’une autre part, il permet de détecter les problèmes rapidement et de les corriger au fur et à mesure en effectuant des tests automatisés grâce au framework pytest.</w:t>
+        <w:t xml:space="preserve">Pour notre travail longitudinal nous avons décidé d’utiliser Python comme langage de programmation. Ce choix a été adopté notamment pour la simplicité et l'accessibilité de ce dernier qui contribueront à la maintenabilité du système. En ce sens, nous considérons que Python est un outil populaire qui possède une vaste communauté et une documentation abondante ce qui permettra à tous une meilleure autonomie. Par ailleurs, celui-ci permet d’obtenir du code lisible, clair et intuitif ce qui facilitera la compréhension et la communication au sein de l’équipe. De plus, Python peut aussi contribuer à la fiabilité du système. D’une part, il offre un moyen robuste de gérer les exceptions grâce à des blocs </w:t>
+      </w:r>
+      <w:proofErr w:type="spellStart"/>
+      <w:r>
+        <w:rPr>
+          <w:rFonts w:ascii="Arial" w:hAnsi="Arial" w:cs="Arial"/>
+        </w:rPr>
+        <w:t>try-except</w:t>
+      </w:r>
+      <w:proofErr w:type="spellEnd"/>
+      <w:r>
+        <w:rPr>
+          <w:rFonts w:ascii="Arial" w:hAnsi="Arial" w:cs="Arial"/>
+        </w:rPr>
+        <w:t xml:space="preserve"> ce qui permettra un meilleur contrôle des erreurs. D’une autre part, il permet de détecter les problèmes rapidement et de les corriger au fur et à mesure en effectuant des tests automatisés grâce au </w:t>
+      </w:r>
+      <w:proofErr w:type="spellStart"/>
+      <w:r>
+        <w:rPr>
+          <w:rFonts w:ascii="Arial" w:hAnsi="Arial" w:cs="Arial"/>
+        </w:rPr>
+        <w:t>framework</w:t>
+      </w:r>
+      <w:proofErr w:type="spellEnd"/>
+      <w:r>
+        <w:rPr>
+          <w:rFonts w:ascii="Arial" w:hAnsi="Arial" w:cs="Arial"/>
+        </w:rPr>
+        <w:t xml:space="preserve"> </w:t>
+      </w:r>
+      <w:proofErr w:type="spellStart"/>
+      <w:r>
+        <w:rPr>
+          <w:rFonts w:ascii="Arial" w:hAnsi="Arial" w:cs="Arial"/>
+        </w:rPr>
+        <w:t>pytest</w:t>
+      </w:r>
+      <w:proofErr w:type="spellEnd"/>
+      <w:r>
+        <w:rPr>
+          <w:rFonts w:ascii="Arial" w:hAnsi="Arial" w:cs="Arial"/>
+        </w:rPr>
+        <w:t>.</w:t>
       </w:r>
     </w:p>
     <w:p>
@@ -3375,13 +3533,41 @@
         </w:rPr>
         <w:t xml:space="preserve">Les types de bases de données que nous avons choisis pour effectuer notre travail longitudinal sont les bases de données orientées document et graphe. Tout d’abord, nous avons choisi le type document car il permet efficacement de stocker les données dans un format qui peut facilement être modifié et qui n’a pas à être constant si les données ne le sont pas elles-mêmes. Ce type est donc bien extensible, ce qui sera un avantage si on doit ajouter de nouvelles données, dont certaines ne seront peut-être pas dans le même format que celles présentes dans la base de données. Dans notre cas, ce type sera utilisé pour stocker les informations sur les restaurants. Nous avons également utilisé le type graphe, car celui-ci permet efficacement de représenter les relations </w:t>
       </w:r>
+      <w:proofErr w:type="spellStart"/>
       <w:r>
         <w:rPr>
           <w:rFonts w:ascii="Arial" w:hAnsi="Arial" w:cs="Arial"/>
           <w:i/>
           <w:iCs/>
         </w:rPr>
-        <w:t xml:space="preserve">many-to-many </w:t>
+        <w:t>many</w:t>
+      </w:r>
+      <w:proofErr w:type="spellEnd"/>
+      <w:r>
+        <w:rPr>
+          <w:rFonts w:ascii="Arial" w:hAnsi="Arial" w:cs="Arial"/>
+          <w:i/>
+          <w:iCs/>
+        </w:rPr>
+        <w:t>-to-</w:t>
+      </w:r>
+      <w:proofErr w:type="spellStart"/>
+      <w:r>
+        <w:rPr>
+          <w:rFonts w:ascii="Arial" w:hAnsi="Arial" w:cs="Arial"/>
+          <w:i/>
+          <w:iCs/>
+        </w:rPr>
+        <w:t>many</w:t>
+      </w:r>
+      <w:proofErr w:type="spellEnd"/>
+      <w:r>
+        <w:rPr>
+          <w:rFonts w:ascii="Arial" w:hAnsi="Arial" w:cs="Arial"/>
+          <w:i/>
+          <w:iCs/>
+        </w:rPr>
+        <w:t xml:space="preserve"> </w:t>
       </w:r>
       <w:r>
         <w:rPr>
@@ -3431,19 +3617,19 @@
           <w:lang w:eastAsia="fr-CA"/>
           <w14:ligatures w14:val="none"/>
         </w:rPr>
-        <w:t>L’extraction initiale des données a été réalisé de deux manières. Premièrement, nous avons utilisé la base de données géographiques OpenStreetMap (OSM) pour extraire les points d'intérêt correspondant aux restaurants. OSM propose une grande variété d’informations, mais nous avons tamisé ceux-ci en garadant uniquement osmid, name, cuisine, coordinates, addr:city, addr:housenumber, addr:postcode, addr:street, opening_hours, phone et description. Ces dernières suffisent pour effectuer une analyse détaillée qui nous permettra de localiser les restaurants. Deuxièmement, nous avons utilisé la même source pour extraire les données relatives aux pistes cyclables. Pour ce cas de figure, nous avons conservé les coordonnées sous forme de liste de points pour une représentation plus exhaustive des chemins.</w:t>
-      </w:r>
-    </w:p>
-    <w:p>
-      <w:pPr>
-        <w:jc w:val="both"/>
+        <w:t xml:space="preserve">L’extraction initiale des données a été réalisé de deux manières. Premièrement, nous avons utilisé la base de données géographiques </w:t>
+      </w:r>
+      <w:proofErr w:type="spellStart"/>
+      <w:r>
         <w:rPr>
           <w:rFonts w:ascii="Arial" w:eastAsia="Times New Roman" w:hAnsi="Arial" w:cs="Arial"/>
           <w:kern w:val="0"/>
           <w:lang w:eastAsia="fr-CA"/>
           <w14:ligatures w14:val="none"/>
         </w:rPr>
-      </w:pPr>
+        <w:t>OpenStreetMap</w:t>
+      </w:r>
+      <w:proofErr w:type="spellEnd"/>
       <w:r>
         <w:rPr>
           <w:rFonts w:ascii="Arial" w:eastAsia="Times New Roman" w:hAnsi="Arial" w:cs="Arial"/>
@@ -3451,101 +3637,9 @@
           <w:lang w:eastAsia="fr-CA"/>
           <w14:ligatures w14:val="none"/>
         </w:rPr>
-        <w:t>Voir l’annexe 12 pour le diagramme UML plus détaillé du processus d’extraction</w:t>
-      </w:r>
-    </w:p>
-    <w:p>
-      <w:pPr>
-        <w:pStyle w:val="Titre2"/>
-        <w:jc w:val="both"/>
-      </w:pPr>
-      <w:bookmarkStart w:id="13" w:name="_Toc183852570"/>
-      <w:r>
-        <w:t>Processus d'Acquisition Incrémental des données</w:t>
-      </w:r>
-      <w:bookmarkEnd w:id="13"/>
-    </w:p>
-    <w:p>
-      <w:pPr>
-        <w:jc w:val="both"/>
-        <w:rPr>
-          <w:rFonts w:ascii="Arial" w:hAnsi="Arial" w:cs="Arial"/>
-        </w:rPr>
-      </w:pPr>
-      <w:r>
-        <w:rPr>
-          <w:rFonts w:ascii="Arial" w:hAnsi="Arial" w:cs="Arial"/>
-        </w:rPr>
-        <w:t xml:space="preserve">Dans le cadre de ce projet, un processus d'acquisition incrémental des données a été défini afin de maintenir les bases de données MongoDB et Neo4J à jour. Cela permet d’éviter les doublons et de gérer efficacement les mises à jour et ajouts futurs. Dans le cas de MongoDB, nous vérifions pour chaque restaurant s’il existe déjà dans la base de données en s’appuyant sur l’ID de ce dernier. Si une correspondance est trouvée, nous mettons à jour les informations nécessaires. Dans le cas contraire, un nouveau document est ajouté à la collection. Dans le cas de Neo4J, pour chaque segment de piste cyclable, nous utilisons des requêtes </w:t>
-      </w:r>
-      <w:r>
-        <w:rPr>
-          <w:rFonts w:ascii="Arial" w:hAnsi="Arial" w:cs="Arial"/>
-          <w:i/>
-          <w:iCs/>
-        </w:rPr>
-        <w:t>MERGE</w:t>
-      </w:r>
-      <w:r>
-        <w:rPr>
-          <w:rFonts w:ascii="Arial" w:hAnsi="Arial" w:cs="Arial"/>
-        </w:rPr>
-        <w:t xml:space="preserve"> afin de vérifier l'existence des nœuds de début et de fin, ainsi que de la relation entre eux. Si le segment est nouveau, il est ajouté en tant que nouvelle relation entre les nœuds correspondants.</w:t>
-      </w:r>
-    </w:p>
-    <w:p>
-      <w:pPr>
-        <w:jc w:val="both"/>
-        <w:rPr>
-          <w:rFonts w:ascii="Arial" w:hAnsi="Arial" w:cs="Arial"/>
-        </w:rPr>
-      </w:pPr>
-      <w:r>
-        <w:rPr>
-          <w:rFonts w:ascii="Arial" w:hAnsi="Arial" w:cs="Arial"/>
-        </w:rPr>
-        <w:t>Voir l’annexe 13 pour le diagramme illustrant le flux des étapes dans le processus d'acquisition incrémental pour MongoDB et Neo4j.</w:t>
-      </w:r>
-    </w:p>
-    <w:p>
-      <w:pPr>
-        <w:jc w:val="both"/>
-        <w:rPr>
-          <w:rFonts w:ascii="Arial" w:hAnsi="Arial" w:cs="Arial"/>
-        </w:rPr>
-      </w:pPr>
-    </w:p>
-    <w:p>
-      <w:pPr>
-        <w:pStyle w:val="Titre2"/>
-        <w:jc w:val="both"/>
-      </w:pPr>
-      <w:bookmarkStart w:id="14" w:name="_Toc183852571"/>
-      <w:r>
-        <w:t>Processus de transformation des données</w:t>
-      </w:r>
-      <w:bookmarkEnd w:id="14"/>
-    </w:p>
-    <w:p>
-      <w:pPr>
-        <w:jc w:val="both"/>
-        <w:rPr>
-          <w:rFonts w:ascii="Arial" w:hAnsi="Arial" w:cs="Arial"/>
-        </w:rPr>
-      </w:pPr>
-      <w:r>
-        <w:rPr>
-          <w:rFonts w:ascii="Arial" w:hAnsi="Arial" w:cs="Arial"/>
-        </w:rPr>
-        <w:t xml:space="preserve">Pour obtenir des données plus compactes et parlantes, nous avons réaliser quelques transformations simples. Pour commencer, nous avons standardiser les </w:t>
-      </w:r>
-      <w:r>
-        <w:rPr>
-          <w:rFonts w:ascii="Arial" w:hAnsi="Arial" w:cs="Arial"/>
-        </w:rPr>
-        <w:lastRenderedPageBreak/>
-        <w:t xml:space="preserve">adresses des restaurants en appliquant </w:t>
-      </w:r>
+        <w:t xml:space="preserve"> (OSM) pour extraire les points d'intérêt correspondant aux restaurants. OSM propose une grande variété d’informations, mais nous avons tamisé ceux-ci en </w:t>
+      </w:r>
+      <w:proofErr w:type="spellStart"/>
       <w:r>
         <w:rPr>
           <w:rFonts w:ascii="Arial" w:eastAsia="Times New Roman" w:hAnsi="Arial" w:cs="Arial"/>
@@ -3553,8 +3647,317 @@
           <w:lang w:eastAsia="fr-CA"/>
           <w14:ligatures w14:val="none"/>
         </w:rPr>
+        <w:t>garadant</w:t>
+      </w:r>
+      <w:proofErr w:type="spellEnd"/>
+      <w:r>
+        <w:rPr>
+          <w:rFonts w:ascii="Arial" w:eastAsia="Times New Roman" w:hAnsi="Arial" w:cs="Arial"/>
+          <w:kern w:val="0"/>
+          <w:lang w:eastAsia="fr-CA"/>
+          <w14:ligatures w14:val="none"/>
+        </w:rPr>
+        <w:t xml:space="preserve"> uniquement </w:t>
+      </w:r>
+      <w:proofErr w:type="spellStart"/>
+      <w:r>
+        <w:rPr>
+          <w:rFonts w:ascii="Arial" w:eastAsia="Times New Roman" w:hAnsi="Arial" w:cs="Arial"/>
+          <w:kern w:val="0"/>
+          <w:lang w:eastAsia="fr-CA"/>
+          <w14:ligatures w14:val="none"/>
+        </w:rPr>
+        <w:t>osmid</w:t>
+      </w:r>
+      <w:proofErr w:type="spellEnd"/>
+      <w:r>
+        <w:rPr>
+          <w:rFonts w:ascii="Arial" w:eastAsia="Times New Roman" w:hAnsi="Arial" w:cs="Arial"/>
+          <w:kern w:val="0"/>
+          <w:lang w:eastAsia="fr-CA"/>
+          <w14:ligatures w14:val="none"/>
+        </w:rPr>
+        <w:t xml:space="preserve">, </w:t>
+      </w:r>
+      <w:proofErr w:type="spellStart"/>
+      <w:r>
+        <w:rPr>
+          <w:rFonts w:ascii="Arial" w:eastAsia="Times New Roman" w:hAnsi="Arial" w:cs="Arial"/>
+          <w:kern w:val="0"/>
+          <w:lang w:eastAsia="fr-CA"/>
+          <w14:ligatures w14:val="none"/>
+        </w:rPr>
+        <w:t>name</w:t>
+      </w:r>
+      <w:proofErr w:type="spellEnd"/>
+      <w:r>
+        <w:rPr>
+          <w:rFonts w:ascii="Arial" w:eastAsia="Times New Roman" w:hAnsi="Arial" w:cs="Arial"/>
+          <w:kern w:val="0"/>
+          <w:lang w:eastAsia="fr-CA"/>
+          <w14:ligatures w14:val="none"/>
+        </w:rPr>
+        <w:t xml:space="preserve">, cuisine, </w:t>
+      </w:r>
+      <w:proofErr w:type="spellStart"/>
+      <w:r>
+        <w:rPr>
+          <w:rFonts w:ascii="Arial" w:eastAsia="Times New Roman" w:hAnsi="Arial" w:cs="Arial"/>
+          <w:kern w:val="0"/>
+          <w:lang w:eastAsia="fr-CA"/>
+          <w14:ligatures w14:val="none"/>
+        </w:rPr>
+        <w:t>coordinates</w:t>
+      </w:r>
+      <w:proofErr w:type="spellEnd"/>
+      <w:r>
+        <w:rPr>
+          <w:rFonts w:ascii="Arial" w:eastAsia="Times New Roman" w:hAnsi="Arial" w:cs="Arial"/>
+          <w:kern w:val="0"/>
+          <w:lang w:eastAsia="fr-CA"/>
+          <w14:ligatures w14:val="none"/>
+        </w:rPr>
+        <w:t xml:space="preserve">, </w:t>
+      </w:r>
+      <w:proofErr w:type="spellStart"/>
+      <w:proofErr w:type="gramStart"/>
+      <w:r>
+        <w:rPr>
+          <w:rFonts w:ascii="Arial" w:eastAsia="Times New Roman" w:hAnsi="Arial" w:cs="Arial"/>
+          <w:kern w:val="0"/>
+          <w:lang w:eastAsia="fr-CA"/>
+          <w14:ligatures w14:val="none"/>
+        </w:rPr>
+        <w:t>addr:city</w:t>
+      </w:r>
+      <w:proofErr w:type="spellEnd"/>
+      <w:proofErr w:type="gramEnd"/>
+      <w:r>
+        <w:rPr>
+          <w:rFonts w:ascii="Arial" w:eastAsia="Times New Roman" w:hAnsi="Arial" w:cs="Arial"/>
+          <w:kern w:val="0"/>
+          <w:lang w:eastAsia="fr-CA"/>
+          <w14:ligatures w14:val="none"/>
+        </w:rPr>
+        <w:t xml:space="preserve">, </w:t>
+      </w:r>
+      <w:proofErr w:type="spellStart"/>
+      <w:r>
+        <w:rPr>
+          <w:rFonts w:ascii="Arial" w:eastAsia="Times New Roman" w:hAnsi="Arial" w:cs="Arial"/>
+          <w:kern w:val="0"/>
+          <w:lang w:eastAsia="fr-CA"/>
+          <w14:ligatures w14:val="none"/>
+        </w:rPr>
+        <w:t>addr:housenumber</w:t>
+      </w:r>
+      <w:proofErr w:type="spellEnd"/>
+      <w:r>
+        <w:rPr>
+          <w:rFonts w:ascii="Arial" w:eastAsia="Times New Roman" w:hAnsi="Arial" w:cs="Arial"/>
+          <w:kern w:val="0"/>
+          <w:lang w:eastAsia="fr-CA"/>
+          <w14:ligatures w14:val="none"/>
+        </w:rPr>
+        <w:t xml:space="preserve">, </w:t>
+      </w:r>
+      <w:proofErr w:type="spellStart"/>
+      <w:r>
+        <w:rPr>
+          <w:rFonts w:ascii="Arial" w:eastAsia="Times New Roman" w:hAnsi="Arial" w:cs="Arial"/>
+          <w:kern w:val="0"/>
+          <w:lang w:eastAsia="fr-CA"/>
+          <w14:ligatures w14:val="none"/>
+        </w:rPr>
+        <w:t>addr:postcode</w:t>
+      </w:r>
+      <w:proofErr w:type="spellEnd"/>
+      <w:r>
+        <w:rPr>
+          <w:rFonts w:ascii="Arial" w:eastAsia="Times New Roman" w:hAnsi="Arial" w:cs="Arial"/>
+          <w:kern w:val="0"/>
+          <w:lang w:eastAsia="fr-CA"/>
+          <w14:ligatures w14:val="none"/>
+        </w:rPr>
+        <w:t xml:space="preserve">, </w:t>
+      </w:r>
+      <w:proofErr w:type="spellStart"/>
+      <w:r>
+        <w:rPr>
+          <w:rFonts w:ascii="Arial" w:eastAsia="Times New Roman" w:hAnsi="Arial" w:cs="Arial"/>
+          <w:kern w:val="0"/>
+          <w:lang w:eastAsia="fr-CA"/>
+          <w14:ligatures w14:val="none"/>
+        </w:rPr>
+        <w:t>addr:street</w:t>
+      </w:r>
+      <w:proofErr w:type="spellEnd"/>
+      <w:r>
+        <w:rPr>
+          <w:rFonts w:ascii="Arial" w:eastAsia="Times New Roman" w:hAnsi="Arial" w:cs="Arial"/>
+          <w:kern w:val="0"/>
+          <w:lang w:eastAsia="fr-CA"/>
+          <w14:ligatures w14:val="none"/>
+        </w:rPr>
+        <w:t xml:space="preserve">, </w:t>
+      </w:r>
+      <w:proofErr w:type="spellStart"/>
+      <w:r>
+        <w:rPr>
+          <w:rFonts w:ascii="Arial" w:eastAsia="Times New Roman" w:hAnsi="Arial" w:cs="Arial"/>
+          <w:kern w:val="0"/>
+          <w:lang w:eastAsia="fr-CA"/>
+          <w14:ligatures w14:val="none"/>
+        </w:rPr>
+        <w:t>opening_hours</w:t>
+      </w:r>
+      <w:proofErr w:type="spellEnd"/>
+      <w:r>
+        <w:rPr>
+          <w:rFonts w:ascii="Arial" w:eastAsia="Times New Roman" w:hAnsi="Arial" w:cs="Arial"/>
+          <w:kern w:val="0"/>
+          <w:lang w:eastAsia="fr-CA"/>
+          <w14:ligatures w14:val="none"/>
+        </w:rPr>
+        <w:t>, phone et description. Ces dernières suffisent pour effectuer une analyse détaillée qui nous permettra de localiser les restaurants. Deuxièmement, nous avons utilisé la même source pour extraire les données relatives aux pistes cyclables. Pour ce cas de figure, nous avons conservé les coordonnées sous forme de liste de points pour une représentation plus exhaustive des chemins.</w:t>
+      </w:r>
+    </w:p>
+    <w:p>
+      <w:pPr>
+        <w:jc w:val="both"/>
+        <w:rPr>
+          <w:rFonts w:ascii="Arial" w:eastAsia="Times New Roman" w:hAnsi="Arial" w:cs="Arial"/>
+          <w:kern w:val="0"/>
+          <w:lang w:eastAsia="fr-CA"/>
+          <w14:ligatures w14:val="none"/>
+        </w:rPr>
+      </w:pPr>
+      <w:r>
+        <w:rPr>
+          <w:rFonts w:ascii="Arial" w:eastAsia="Times New Roman" w:hAnsi="Arial" w:cs="Arial"/>
+          <w:kern w:val="0"/>
+          <w:lang w:eastAsia="fr-CA"/>
+          <w14:ligatures w14:val="none"/>
+        </w:rPr>
+        <w:t>Voir l’annexe 12 pour le diagramme UML plus détaillé du processus d’extraction</w:t>
+      </w:r>
+    </w:p>
+    <w:p>
+      <w:pPr>
+        <w:pStyle w:val="Titre2"/>
+        <w:jc w:val="both"/>
+      </w:pPr>
+      <w:bookmarkStart w:id="13" w:name="_Toc183852570"/>
+      <w:r>
+        <w:t>Processus d'Acquisition Incrémental des données</w:t>
+      </w:r>
+      <w:bookmarkEnd w:id="13"/>
+    </w:p>
+    <w:p>
+      <w:pPr>
+        <w:jc w:val="both"/>
+        <w:rPr>
+          <w:rFonts w:ascii="Arial" w:hAnsi="Arial" w:cs="Arial"/>
+        </w:rPr>
+      </w:pPr>
+      <w:r>
+        <w:rPr>
+          <w:rFonts w:ascii="Arial" w:hAnsi="Arial" w:cs="Arial"/>
+        </w:rPr>
+        <w:t xml:space="preserve">Dans le cadre de ce projet, un processus d'acquisition incrémental des données a été défini afin de maintenir les bases de données MongoDB et Neo4J à jour. Cela permet d’éviter les doublons et de gérer efficacement les mises à jour et ajouts futurs. Dans le cas de MongoDB, nous vérifions pour chaque restaurant s’il existe déjà dans la base de données en s’appuyant sur l’ID de ce dernier. Si une correspondance est trouvée, nous mettons à jour les informations nécessaires. Dans le cas contraire, un nouveau document est ajouté à la collection. Dans le cas de Neo4J, pour chaque segment de piste cyclable, nous utilisons des requêtes </w:t>
+      </w:r>
+      <w:r>
+        <w:rPr>
+          <w:rFonts w:ascii="Arial" w:hAnsi="Arial" w:cs="Arial"/>
+          <w:i/>
+          <w:iCs/>
+        </w:rPr>
+        <w:t>MERGE</w:t>
+      </w:r>
+      <w:r>
+        <w:rPr>
+          <w:rFonts w:ascii="Arial" w:hAnsi="Arial" w:cs="Arial"/>
+        </w:rPr>
+        <w:t xml:space="preserve"> afin de vérifier l'existence des nœuds de début et de fin, ainsi que de la relation entre eux. Si le segment est nouveau, il est ajouté en tant que nouvelle relation entre les nœuds correspondants.</w:t>
+      </w:r>
+    </w:p>
+    <w:p>
+      <w:pPr>
+        <w:jc w:val="both"/>
+        <w:rPr>
+          <w:rFonts w:ascii="Arial" w:hAnsi="Arial" w:cs="Arial"/>
+        </w:rPr>
+      </w:pPr>
+      <w:r>
+        <w:rPr>
+          <w:rFonts w:ascii="Arial" w:hAnsi="Arial" w:cs="Arial"/>
+        </w:rPr>
+        <w:t>Voir l’annexe 13 pour le diagramme illustrant le flux des étapes dans le processus d'acquisition incrémental pour MongoDB et Neo4j.</w:t>
+      </w:r>
+    </w:p>
+    <w:p>
+      <w:pPr>
+        <w:jc w:val="both"/>
+        <w:rPr>
+          <w:rFonts w:ascii="Arial" w:hAnsi="Arial" w:cs="Arial"/>
+        </w:rPr>
+      </w:pPr>
+    </w:p>
+    <w:p>
+      <w:pPr>
+        <w:pStyle w:val="Titre2"/>
+        <w:jc w:val="both"/>
+      </w:pPr>
+      <w:bookmarkStart w:id="14" w:name="_Toc183852571"/>
+      <w:r>
+        <w:t>Processus de transformation des données</w:t>
+      </w:r>
+      <w:bookmarkEnd w:id="14"/>
+    </w:p>
+    <w:p>
+      <w:pPr>
+        <w:jc w:val="both"/>
+        <w:rPr>
+          <w:rFonts w:ascii="Arial" w:hAnsi="Arial" w:cs="Arial"/>
+        </w:rPr>
+      </w:pPr>
+      <w:r>
+        <w:rPr>
+          <w:rFonts w:ascii="Arial" w:hAnsi="Arial" w:cs="Arial"/>
+        </w:rPr>
+        <w:t xml:space="preserve">Pour obtenir des données plus compactes et parlantes, nous avons </w:t>
+      </w:r>
+      <w:proofErr w:type="spellStart"/>
+      <w:r>
+        <w:rPr>
+          <w:rFonts w:ascii="Arial" w:hAnsi="Arial" w:cs="Arial"/>
+        </w:rPr>
+        <w:t>réaliser</w:t>
+      </w:r>
+      <w:proofErr w:type="spellEnd"/>
+      <w:r>
+        <w:rPr>
+          <w:rFonts w:ascii="Arial" w:hAnsi="Arial" w:cs="Arial"/>
+        </w:rPr>
+        <w:t xml:space="preserve"> quelques transformations simples. Pour commencer, nous avons standardiser les </w:t>
+      </w:r>
+      <w:r>
+        <w:rPr>
+          <w:rFonts w:ascii="Arial" w:hAnsi="Arial" w:cs="Arial"/>
+        </w:rPr>
+        <w:lastRenderedPageBreak/>
+        <w:t xml:space="preserve">adresses des restaurants en appliquant </w:t>
+      </w:r>
+      <w:r>
+        <w:rPr>
+          <w:rFonts w:ascii="Arial" w:eastAsia="Times New Roman" w:hAnsi="Arial" w:cs="Arial"/>
+          <w:kern w:val="0"/>
+          <w:lang w:eastAsia="fr-CA"/>
+          <w14:ligatures w14:val="none"/>
+        </w:rPr>
         <w:t xml:space="preserve">un format canadien. Ainsi, chaque adresse est désormais représentée sous la forme "Numéro de maison, Rue, Ville, Code postal". Par la suite, nous avons traduit les colonnes en français et renommer certaines d’entre-elles pour qu’elles soient plus adapté à notre contexte. Effectivement, la colonne </w:t>
       </w:r>
+      <w:proofErr w:type="spellStart"/>
       <w:r>
         <w:rPr>
           <w:rFonts w:ascii="Arial" w:eastAsia="Times New Roman" w:hAnsi="Arial" w:cs="Arial"/>
@@ -3566,6 +3969,7 @@
         </w:rPr>
         <w:t>name</w:t>
       </w:r>
+      <w:proofErr w:type="spellEnd"/>
       <w:r>
         <w:rPr>
           <w:rFonts w:ascii="Arial" w:eastAsia="Times New Roman" w:hAnsi="Arial" w:cs="Arial"/>
@@ -3595,6 +3999,7 @@
         </w:rPr>
         <w:t xml:space="preserve">, et la colonne cuisine a été remplacée par </w:t>
       </w:r>
+      <w:proofErr w:type="spellStart"/>
       <w:r>
         <w:rPr>
           <w:rFonts w:ascii="Arial" w:eastAsia="Times New Roman" w:hAnsi="Arial" w:cs="Arial"/>
@@ -3606,6 +4011,7 @@
         </w:rPr>
         <w:t>type_de_restaurant</w:t>
       </w:r>
+      <w:proofErr w:type="spellEnd"/>
       <w:r>
         <w:rPr>
           <w:rFonts w:ascii="Arial" w:eastAsia="Times New Roman" w:hAnsi="Arial" w:cs="Arial"/>
@@ -3615,6 +4021,7 @@
         </w:rPr>
         <w:t xml:space="preserve">. Finalement, nous avons procédé à la classification des restaurants et services. En ce sens, les différents restaurants sont maintenant divisés par type selon la colonne </w:t>
       </w:r>
+      <w:proofErr w:type="spellStart"/>
       <w:r>
         <w:rPr>
           <w:rFonts w:ascii="Arial" w:eastAsia="Times New Roman" w:hAnsi="Arial" w:cs="Arial"/>
@@ -3626,6 +4033,7 @@
         </w:rPr>
         <w:t>type_de_restaurant</w:t>
       </w:r>
+      <w:proofErr w:type="spellEnd"/>
       <w:r>
         <w:rPr>
           <w:rFonts w:ascii="Arial" w:eastAsia="Times New Roman" w:hAnsi="Arial" w:cs="Arial"/>
@@ -3635,6 +4043,7 @@
         </w:rPr>
         <w:t xml:space="preserve"> et on a ajouté la colonne </w:t>
       </w:r>
+      <w:proofErr w:type="spellStart"/>
       <w:r>
         <w:rPr>
           <w:rFonts w:ascii="Arial" w:eastAsia="Times New Roman" w:hAnsi="Arial" w:cs="Arial"/>
@@ -3646,6 +4055,7 @@
         </w:rPr>
         <w:t>type_de_service</w:t>
       </w:r>
+      <w:proofErr w:type="spellEnd"/>
       <w:r>
         <w:rPr>
           <w:rFonts w:ascii="Arial" w:eastAsia="Times New Roman" w:hAnsi="Arial" w:cs="Arial"/>
@@ -3653,7 +4063,47 @@
           <w:lang w:eastAsia="fr-CA"/>
           <w14:ligatures w14:val="none"/>
         </w:rPr>
-        <w:t xml:space="preserve"> pour classifier les services. Cette dernière a été créé à partir de la description du restaurant. Par exemple, "emporté" est classé comme "Service à emporter", "uber eats" comme "Service de livraison", "buffet" ou "À volonté" comme "Buffet / À volonté". Cette distinction est essentielle pour mieux comprendre l'expérience de restauration proposée.</w:t>
+        <w:t xml:space="preserve"> pour classifier les services. Cette dernière a été créé à partir de la description du restaurant. Par exemple, "emporté" est classé comme "Service à emporter", "</w:t>
+      </w:r>
+      <w:proofErr w:type="spellStart"/>
+      <w:r>
+        <w:rPr>
+          <w:rFonts w:ascii="Arial" w:eastAsia="Times New Roman" w:hAnsi="Arial" w:cs="Arial"/>
+          <w:kern w:val="0"/>
+          <w:lang w:eastAsia="fr-CA"/>
+          <w14:ligatures w14:val="none"/>
+        </w:rPr>
+        <w:t>uber</w:t>
+      </w:r>
+      <w:proofErr w:type="spellEnd"/>
+      <w:r>
+        <w:rPr>
+          <w:rFonts w:ascii="Arial" w:eastAsia="Times New Roman" w:hAnsi="Arial" w:cs="Arial"/>
+          <w:kern w:val="0"/>
+          <w:lang w:eastAsia="fr-CA"/>
+          <w14:ligatures w14:val="none"/>
+        </w:rPr>
+        <w:t xml:space="preserve"> </w:t>
+      </w:r>
+      <w:proofErr w:type="spellStart"/>
+      <w:r>
+        <w:rPr>
+          <w:rFonts w:ascii="Arial" w:eastAsia="Times New Roman" w:hAnsi="Arial" w:cs="Arial"/>
+          <w:kern w:val="0"/>
+          <w:lang w:eastAsia="fr-CA"/>
+          <w14:ligatures w14:val="none"/>
+        </w:rPr>
+        <w:t>eats</w:t>
+      </w:r>
+      <w:proofErr w:type="spellEnd"/>
+      <w:r>
+        <w:rPr>
+          <w:rFonts w:ascii="Arial" w:eastAsia="Times New Roman" w:hAnsi="Arial" w:cs="Arial"/>
+          <w:kern w:val="0"/>
+          <w:lang w:eastAsia="fr-CA"/>
+          <w14:ligatures w14:val="none"/>
+        </w:rPr>
+        <w:t>" comme "Service de livraison", "buffet" ou "À volonté" comme "Buffet / À volonté". Cette distinction est essentielle pour mieux comprendre l'expérience de restauration proposée.</w:t>
       </w:r>
     </w:p>
     <w:p>
@@ -3887,7 +4337,15 @@
         <w:t xml:space="preserve"> impact sur le volume de données à emmagasiner. En ce sens, la région de Normandie possède une quantité importante de pistes cyclables : « </w:t>
       </w:r>
       <w:r>
-        <w:t>Une fréquentation qui reflète l’attractivité des 1 700 km de véloroutes que compte la région.</w:t>
+        <w:t xml:space="preserve">Une fréquentation qui reflète l’attractivité des 1 700 km de </w:t>
+      </w:r>
+      <w:proofErr w:type="spellStart"/>
+      <w:r>
+        <w:t>véloroutes</w:t>
+      </w:r>
+      <w:proofErr w:type="spellEnd"/>
+      <w:r>
+        <w:t xml:space="preserve"> que compte la région.</w:t>
       </w:r>
       <w:r>
         <w:t xml:space="preserve"> »</w:t>
@@ -3947,6 +4405,23 @@
       <w:bookmarkEnd w:id="19"/>
     </w:p>
     <w:p>
+      <w:r>
+        <w:t>Nous fragmenterons nos données en sous-ensemble</w:t>
+      </w:r>
+      <w:r>
+        <w:t>s</w:t>
+      </w:r>
+      <w:r>
+        <w:t xml:space="preserve"> pour faciliter l’extensibilité et améliorer la performance de notre application. </w:t>
+      </w:r>
+      <w:r>
+        <w:t>Pour les restaurants, nous implémenterons un partitionnement horizontal basé sur la localisation géographique des données. En ce sens, chaque région (Paris, Normandie) correspondra à un fragment différent. Pour ce qui est des pistes cyclables, on procédera sensiblement de la même manière. Effectivement, nous formerons des sous-graphes pour chaque région qui seront stockés dans des nœuds différents. Toutefois, il faudra utiliser des nœuds-pivots permettant de connecter les différentes sous-graphes lorsqu’un parcours partage plusieurs régions. Nous estimons que cette méthode de partitionnement permettra d’accroître le taux de requêtes par seconde car le</w:t>
+      </w:r>
+      <w:r>
+        <w:t>s différents nœuds seront responsables d’un ensemble de données restreint. Par exemple, les utilisateurs recherchant des parcours en Normandie n’interrogeront que les fragments contenant des données propres à cette région ce qui réduira la latence globale.</w:t>
+      </w:r>
+    </w:p>
+    <w:p>
       <w:pPr>
         <w:pStyle w:val="Titre2"/>
       </w:pPr>
@@ -3960,6 +4435,7 @@
       <w:r>
         <w:t xml:space="preserve">Un utilisateur pourra se connecter à notre application pour rechercher un itinéraire à vélo permettant des arrêts dans divers restaurants. L’application devra alors interroger la base de données MongoDB pour obtenir des informations sur les restaurants et Neo4J pour calculer les trajets via les pistes cyclables. Afin d’éviter que l’utilisateur puisse exploiter une faille pour injecter des requêtes malveillantes et corrompre les données, il pourrait être judicieux d’implémenter une validation stricte des entrées utilisateurs. Par exemple, nous pourrions vérifier le format des coordonnées géographiques ou encore spécifier les mots-clés autorisés. Dans le cas de Neo4J, nous pourrions utiliser des paramètres dans les requêtes </w:t>
       </w:r>
+      <w:proofErr w:type="spellStart"/>
       <w:r>
         <w:rPr>
           <w:i/>
@@ -3967,6 +4443,7 @@
         </w:rPr>
         <w:t>Cypher</w:t>
       </w:r>
+      <w:proofErr w:type="spellEnd"/>
       <w:r>
         <w:t>.</w:t>
       </w:r>
@@ -3976,7 +4453,11 @@
         <w:t>Un administrateur pourra ajouter de nouveaux restaurants ou de nouvelles pistes cyclables à nos bases de données. Celui-ci pourra insérer de nouveaux documents dans MongoDB et créer de nouveaux nœuds et/ou relations dans Neo4J.</w:t>
       </w:r>
       <w:r>
-        <w:t xml:space="preserve"> Afin d’éviter qu’un individu mal intentionné puisse exploiter les identifiants d’un administrateur pour manipuler ou supprimer des données critiques, il pourrait être intéressant de mettre en place un contrôle d’accès basé sur les rôles. Par exemple, nous pourrions restreindre l’accès en écriture aux différents documents de notre base de données MongoDB. Par ailleurs, l’erreur étant humaine, un administrateur pourrait ajouter des données incorrectes ou supprimer des données importantes par inattention. Afin de limiter les conséquences de telles erreurs, il pourrait être judicieux encore une fois de limiter les permissions de l’administrateur par l’utilisation des rôles dans le cas de MongoDB et en mettant en place des sauvegardes automatiques des bases de données à intervalles réguliers</w:t>
+        <w:t xml:space="preserve"> Afin d’éviter qu’un individu mal intentionné puisse exploiter les identifiants d’un administrateur pour manipuler ou supprimer des données critiques, il pourrait être intéressant de mettre en place un contrôle d’accès basé sur les rôles. Par exemple, nous pourrions restreindre l’accès en écriture aux différents documents de notre base de données MongoDB. Par ailleurs, l’erreur étant humaine, un administrateur pourrait ajouter des données incorrectes ou supprimer des données importantes par inattention. Afin de limiter les conséquences de telles erreurs, il pourrait être judicieux encore une fois de limiter les permissions de l’administrateur par </w:t>
+      </w:r>
+      <w:r>
+        <w:lastRenderedPageBreak/>
+        <w:t>l’utilisation des rôles dans le cas de MongoDB et en mettant en place des sauvegardes automatiques des bases de données à intervalles réguliers</w:t>
       </w:r>
       <w:r>
         <w:t xml:space="preserve"> ce qui nous permettra de restaurer le système en cas de problème majeur.</w:t>
@@ -4012,7 +4493,21 @@
         <w:rPr>
           <w:rFonts w:ascii="Arial" w:hAnsi="Arial" w:cs="Arial"/>
         </w:rPr>
-        <w:t>Exemple de code Python pour récupérer des “amenity” restaurant de la ville Rimouski</w:t>
+        <w:t>Exemple de code Python pour récupérer des “</w:t>
+      </w:r>
+      <w:proofErr w:type="spellStart"/>
+      <w:r>
+        <w:rPr>
+          <w:rFonts w:ascii="Arial" w:hAnsi="Arial" w:cs="Arial"/>
+        </w:rPr>
+        <w:t>amenity</w:t>
+      </w:r>
+      <w:proofErr w:type="spellEnd"/>
+      <w:r>
+        <w:rPr>
+          <w:rFonts w:ascii="Arial" w:hAnsi="Arial" w:cs="Arial"/>
+        </w:rPr>
+        <w:t>” restaurant de la ville Rimouski</w:t>
       </w:r>
     </w:p>
     <w:p>
@@ -4025,7 +4520,6 @@
         <w:rPr>
           <w:noProof/>
         </w:rPr>
-        <w:lastRenderedPageBreak/>
         <w:drawing>
           <wp:inline distT="0" distB="0" distL="0" distR="0" wp14:anchorId="03EB87C2" wp14:editId="7DC3CC74">
             <wp:extent cx="5486400" cy="1138555"/>
@@ -4085,7 +4579,21 @@
         <w:rPr>
           <w:rFonts w:ascii="Arial" w:hAnsi="Arial" w:cs="Arial"/>
         </w:rPr>
-        <w:t>Exemple de requête envoyé vers l’API de OpenRouteService pour l’itinéraire en vélo entre deux points (dans notre cas, les points seront des coordonnées de restaurants, la clé est omise par standard de confidentialité)</w:t>
+        <w:t xml:space="preserve">Exemple de requête envoyé vers l’API de </w:t>
+      </w:r>
+      <w:proofErr w:type="spellStart"/>
+      <w:r>
+        <w:rPr>
+          <w:rFonts w:ascii="Arial" w:hAnsi="Arial" w:cs="Arial"/>
+        </w:rPr>
+        <w:t>OpenRouteService</w:t>
+      </w:r>
+      <w:proofErr w:type="spellEnd"/>
+      <w:r>
+        <w:rPr>
+          <w:rFonts w:ascii="Arial" w:hAnsi="Arial" w:cs="Arial"/>
+        </w:rPr>
+        <w:t xml:space="preserve"> pour l’itinéraire en vélo entre deux points (dans notre cas, les points seront des coordonnées de restaurants, la clé est omise par standard de confidentialité)</w:t>
       </w:r>
     </w:p>
     <w:p>
@@ -4157,7 +4665,35 @@
         <w:rPr>
           <w:rFonts w:ascii="Arial" w:hAnsi="Arial" w:cs="Arial"/>
         </w:rPr>
-        <w:t>Exemple de structure d’un GeoDataFrame créé par le code de l’Annexe 1 qui contiendra les restaurants de la ville (généré par intelligence artificielle ChatGPT 4o)</w:t>
+        <w:t xml:space="preserve">Exemple de structure d’un </w:t>
+      </w:r>
+      <w:proofErr w:type="spellStart"/>
+      <w:r>
+        <w:rPr>
+          <w:rFonts w:ascii="Arial" w:hAnsi="Arial" w:cs="Arial"/>
+        </w:rPr>
+        <w:t>GeoDataFrame</w:t>
+      </w:r>
+      <w:proofErr w:type="spellEnd"/>
+      <w:r>
+        <w:rPr>
+          <w:rFonts w:ascii="Arial" w:hAnsi="Arial" w:cs="Arial"/>
+        </w:rPr>
+        <w:t xml:space="preserve"> créé par le code de l’Annexe 1 qui contiendra les restaurants de la ville (généré par intelligence artificielle </w:t>
+      </w:r>
+      <w:proofErr w:type="spellStart"/>
+      <w:r>
+        <w:rPr>
+          <w:rFonts w:ascii="Arial" w:hAnsi="Arial" w:cs="Arial"/>
+        </w:rPr>
+        <w:t>ChatGPT</w:t>
+      </w:r>
+      <w:proofErr w:type="spellEnd"/>
+      <w:r>
+        <w:rPr>
+          <w:rFonts w:ascii="Arial" w:hAnsi="Arial" w:cs="Arial"/>
+        </w:rPr>
+        <w:t xml:space="preserve"> 4o)</w:t>
       </w:r>
     </w:p>
     <w:p>
@@ -4229,7 +4765,28 @@
         <w:rPr>
           <w:rFonts w:ascii="Arial" w:hAnsi="Arial" w:cs="Arial"/>
         </w:rPr>
-        <w:t>Exemple d’objet JSON retourné par une requête de format similaire à celle présentée à l’Annexe 2 (les champs distance (en mètres) et duration (en secondes) correspondent aux détails du trajet global, le champ concaténé “steps” énumère les différentes étapes du trajet avec instruction de déplacement progressive)</w:t>
+        <w:t xml:space="preserve">Exemple d’objet JSON retourné par une requête de format similaire à celle présentée à l’Annexe 2 (les champs distance (en mètres) et duration (en </w:t>
+      </w:r>
+      <w:r>
+        <w:rPr>
+          <w:rFonts w:ascii="Arial" w:hAnsi="Arial" w:cs="Arial"/>
+        </w:rPr>
+        <w:lastRenderedPageBreak/>
+        <w:t>secondes) correspondent aux détails du trajet global, le champ concaténé “</w:t>
+      </w:r>
+      <w:proofErr w:type="spellStart"/>
+      <w:r>
+        <w:rPr>
+          <w:rFonts w:ascii="Arial" w:hAnsi="Arial" w:cs="Arial"/>
+        </w:rPr>
+        <w:t>steps</w:t>
+      </w:r>
+      <w:proofErr w:type="spellEnd"/>
+      <w:r>
+        <w:rPr>
+          <w:rFonts w:ascii="Arial" w:hAnsi="Arial" w:cs="Arial"/>
+        </w:rPr>
+        <w:t>” énumère les différentes étapes du trajet avec instruction de déplacement progressive)</w:t>
       </w:r>
     </w:p>
     <w:p>
@@ -4242,7 +4799,6 @@
         <w:rPr>
           <w:noProof/>
         </w:rPr>
-        <w:lastRenderedPageBreak/>
         <w:drawing>
           <wp:inline distT="0" distB="0" distL="0" distR="0" wp14:anchorId="219648A8" wp14:editId="1D6E2954">
             <wp:extent cx="5486400" cy="3696970"/>
@@ -4387,6 +4943,7 @@
         <w:rPr>
           <w:noProof/>
         </w:rPr>
+        <w:lastRenderedPageBreak/>
         <w:drawing>
           <wp:inline distT="0" distB="0" distL="0" distR="0" wp14:anchorId="1FB02EF4" wp14:editId="45060A73">
             <wp:extent cx="5337810" cy="1371600"/>
@@ -4432,7 +4989,6 @@
       </w:pPr>
       <w:bookmarkStart w:id="28" w:name="_Toc183852585"/>
       <w:r>
-        <w:lastRenderedPageBreak/>
         <w:t>Annexe 7</w:t>
       </w:r>
       <w:bookmarkEnd w:id="28"/>
@@ -4676,6 +5232,7 @@
         <w:rPr>
           <w:noProof/>
         </w:rPr>
+        <w:lastRenderedPageBreak/>
         <w:drawing>
           <wp:inline distT="0" distB="0" distL="0" distR="0" wp14:anchorId="23F6352E" wp14:editId="3762F12A">
             <wp:extent cx="5486400" cy="628650"/>
@@ -4750,7 +5307,6 @@
         <w:rPr>
           <w:noProof/>
         </w:rPr>
-        <w:lastRenderedPageBreak/>
         <w:drawing>
           <wp:inline distT="0" distB="0" distL="0" distR="0" wp14:anchorId="69CAAEB9" wp14:editId="1F9DE093">
             <wp:extent cx="5486400" cy="520065"/>
@@ -5194,7 +5750,21 @@
         <w:rPr>
           <w:rFonts w:ascii="Arial" w:hAnsi="Arial" w:cs="Arial"/>
         </w:rPr>
-        <w:t>Certaines parties de ce projet ont été réalisées avec l’aide de l’assistant IA ChatGPT, en particulier pour :</w:t>
+        <w:t xml:space="preserve">Certaines parties de ce projet ont été réalisées avec l’aide de l’assistant IA </w:t>
+      </w:r>
+      <w:proofErr w:type="spellStart"/>
+      <w:r>
+        <w:rPr>
+          <w:rFonts w:ascii="Arial" w:hAnsi="Arial" w:cs="Arial"/>
+        </w:rPr>
+        <w:t>ChatGPT</w:t>
+      </w:r>
+      <w:proofErr w:type="spellEnd"/>
+      <w:r>
+        <w:rPr>
+          <w:rFonts w:ascii="Arial" w:hAnsi="Arial" w:cs="Arial"/>
+        </w:rPr>
+        <w:t>, en particulier pour :</w:t>
       </w:r>
     </w:p>
     <w:p>
@@ -5219,7 +5789,21 @@
         <w:rPr>
           <w:rFonts w:ascii="Arial" w:hAnsi="Arial" w:cs="Arial"/>
         </w:rPr>
-        <w:t xml:space="preserve"> Le script wait_for_neo4j() utilisé dans load.py pour s'assurer que Neo4j est prêt avant le chargement des données. Ce script attend la disponibilité de Neo4j en tentant de se connecter de manière répétée jusqu'à ce que le service soit prêt.</w:t>
+        <w:t xml:space="preserve"> Le script wait_for_neo4</w:t>
+      </w:r>
+      <w:proofErr w:type="gramStart"/>
+      <w:r>
+        <w:rPr>
+          <w:rFonts w:ascii="Arial" w:hAnsi="Arial" w:cs="Arial"/>
+        </w:rPr>
+        <w:t>j(</w:t>
+      </w:r>
+      <w:proofErr w:type="gramEnd"/>
+      <w:r>
+        <w:rPr>
+          <w:rFonts w:ascii="Arial" w:hAnsi="Arial" w:cs="Arial"/>
+        </w:rPr>
+        <w:t>) utilisé dans load.py pour s'assurer que Neo4j est prêt avant le chargement des données. Ce script attend la disponibilité de Neo4j en tentant de se connecter de manière répétée jusqu'à ce que le service soit prêt.</w:t>
       </w:r>
     </w:p>
     <w:p>
@@ -5238,13 +5822,59 @@
           <w:b/>
           <w:bCs/>
         </w:rPr>
-        <w:t>Exécution automatique des scripts dans le Dockerfile :</w:t>
-      </w:r>
-      <w:r>
-        <w:rPr>
-          <w:rFonts w:ascii="Arial" w:hAnsi="Arial" w:cs="Arial"/>
-        </w:rPr>
-        <w:t xml:space="preserve"> La commande utilisée dans le Dockerfile pour exécuter les scripts ETL (extract.py, transform.py, load.py) a également été suggérée par ChatGPT. Cette commande garantit que le processus ETL se lance automatiquement lors du démarrage des conteneurs avec docker-compose up.</w:t>
+        <w:t xml:space="preserve">Exécution automatique des scripts dans le </w:t>
+      </w:r>
+      <w:proofErr w:type="spellStart"/>
+      <w:r>
+        <w:rPr>
+          <w:rFonts w:ascii="Arial" w:hAnsi="Arial" w:cs="Arial"/>
+          <w:b/>
+          <w:bCs/>
+        </w:rPr>
+        <w:t>Dockerfile</w:t>
+      </w:r>
+      <w:proofErr w:type="spellEnd"/>
+      <w:r>
+        <w:rPr>
+          <w:rFonts w:ascii="Arial" w:hAnsi="Arial" w:cs="Arial"/>
+          <w:b/>
+          <w:bCs/>
+        </w:rPr>
+        <w:t xml:space="preserve"> :</w:t>
+      </w:r>
+      <w:r>
+        <w:rPr>
+          <w:rFonts w:ascii="Arial" w:hAnsi="Arial" w:cs="Arial"/>
+        </w:rPr>
+        <w:t xml:space="preserve"> La commande utilisée dans le </w:t>
+      </w:r>
+      <w:proofErr w:type="spellStart"/>
+      <w:r>
+        <w:rPr>
+          <w:rFonts w:ascii="Arial" w:hAnsi="Arial" w:cs="Arial"/>
+        </w:rPr>
+        <w:t>Dockerfile</w:t>
+      </w:r>
+      <w:proofErr w:type="spellEnd"/>
+      <w:r>
+        <w:rPr>
+          <w:rFonts w:ascii="Arial" w:hAnsi="Arial" w:cs="Arial"/>
+        </w:rPr>
+        <w:t xml:space="preserve"> pour exécuter les scripts ETL (extract.py, transform.py, load.py) a également été suggérée par </w:t>
+      </w:r>
+      <w:proofErr w:type="spellStart"/>
+      <w:r>
+        <w:rPr>
+          <w:rFonts w:ascii="Arial" w:hAnsi="Arial" w:cs="Arial"/>
+        </w:rPr>
+        <w:t>ChatGPT</w:t>
+      </w:r>
+      <w:proofErr w:type="spellEnd"/>
+      <w:r>
+        <w:rPr>
+          <w:rFonts w:ascii="Arial" w:hAnsi="Arial" w:cs="Arial"/>
+        </w:rPr>
+        <w:t>. Cette commande garantit que le processus ETL se lance automatiquement lors du démarrage des conteneurs avec docker-compose up.</w:t>
       </w:r>
     </w:p>
     <w:p>
@@ -5269,7 +5899,21 @@
         <w:rPr>
           <w:rFonts w:ascii="Arial" w:hAnsi="Arial" w:cs="Arial"/>
         </w:rPr>
-        <w:t>Pour améliorer l’efficacité de notre création de diagramme UML, nous avons utilisé l’outil DiagramGPT. Cet outil nous a permis de générer des ébauches de diagramme basé sur notre code, que nous avons bien évidemment adapter pour qu’ils correspondent à notre travail. On a donc pu avoir plus de facilité le processus de création de diagramme UML.</w:t>
+        <w:t xml:space="preserve">Pour améliorer l’efficacité de notre création de diagramme UML, nous avons utilisé l’outil </w:t>
+      </w:r>
+      <w:proofErr w:type="spellStart"/>
+      <w:r>
+        <w:rPr>
+          <w:rFonts w:ascii="Arial" w:hAnsi="Arial" w:cs="Arial"/>
+        </w:rPr>
+        <w:t>DiagramGPT</w:t>
+      </w:r>
+      <w:proofErr w:type="spellEnd"/>
+      <w:r>
+        <w:rPr>
+          <w:rFonts w:ascii="Arial" w:hAnsi="Arial" w:cs="Arial"/>
+        </w:rPr>
+        <w:t>. Cet outil nous a permis de générer des ébauches de diagramme basé sur notre code, que nous avons bien évidemment adapter pour qu’ils correspondent à notre travail. On a donc pu avoir plus de facilité le processus de création de diagramme UML.</w:t>
       </w:r>
     </w:p>
     <w:p>
@@ -5376,7 +6020,15 @@
         <w:footnoteRef/>
       </w:r>
       <w:r>
-        <w:t xml:space="preserve"> Wikipedia, « Normandie », dernière modification le 30 novembre 2024, consulté le [30 novembre 2024], </w:t>
+        <w:t xml:space="preserve"> </w:t>
+      </w:r>
+      <w:proofErr w:type="spellStart"/>
+      <w:r>
+        <w:t>Wikipedia</w:t>
+      </w:r>
+      <w:proofErr w:type="spellEnd"/>
+      <w:r>
+        <w:t xml:space="preserve">, « Normandie », dernière modification le 30 novembre 2024, consulté le [30 novembre 2024], </w:t>
       </w:r>
       <w:r>
         <w:t>https://fr.wikipedia.org/wiki/Normandie</w:t>
@@ -5398,7 +6050,23 @@
         <w:footnoteRef/>
       </w:r>
       <w:r>
-        <w:t xml:space="preserve"> Weelz, « Le tourisme à vélo, un levier économique pour les territoires – Exemple avec la Normandie », Ouset-France, consulté le [30 novembre 2024], </w:t>
+        <w:t xml:space="preserve"> </w:t>
+      </w:r>
+      <w:proofErr w:type="spellStart"/>
+      <w:r>
+        <w:t>Weelz</w:t>
+      </w:r>
+      <w:proofErr w:type="spellEnd"/>
+      <w:r>
+        <w:t xml:space="preserve">, « Le tourisme à vélo, un levier économique pour les territoires – Exemple avec la Normandie », </w:t>
+      </w:r>
+      <w:proofErr w:type="spellStart"/>
+      <w:r>
+        <w:t>Ouset-France</w:t>
+      </w:r>
+      <w:proofErr w:type="spellEnd"/>
+      <w:r>
+        <w:t xml:space="preserve">, consulté le [30 novembre 2024], </w:t>
       </w:r>
       <w:r>
         <w:t>https://weelz.ouest-france.fr/le-tourisme-a-velo-un-levier-economique-pour-les-territoires-exemple-avec-la-normandie/</w:t>
@@ -5436,7 +6104,15 @@
         <w:footnoteRef/>
       </w:r>
       <w:r>
-        <w:t xml:space="preserve"> ViaMichelin, « Restaurants en Normandie », consulté le [30 novembre 2024], </w:t>
+        <w:t xml:space="preserve"> </w:t>
+      </w:r>
+      <w:proofErr w:type="spellStart"/>
+      <w:r>
+        <w:t>ViaMichelin</w:t>
+      </w:r>
+      <w:proofErr w:type="spellEnd"/>
+      <w:r>
+        <w:t xml:space="preserve">, « Restaurants en Normandie », consulté le [30 novembre 2024], </w:t>
       </w:r>
       <w:r>
         <w:t>https://www.viamichelin.fr/cartes-plans/restaurants/france/normandie</w:t>

</xml_diff>